<commit_message>
nmv 17 06 2026
</commit_message>
<xml_diff>
--- a/TS-Padam/TS-5.7/TS 5.7 Malayalam Pada Paatam Corrections.docx
+++ b/TS-Padam/TS-5.7/TS 5.7 Malayalam Pada Paatam Corrections.docx
@@ -59,9 +59,10 @@
           <w:bCs/>
           <w:sz w:val="32"/>
           <w:szCs w:val="32"/>
+          <w:highlight w:val="red"/>
           <w:u w:val="single"/>
         </w:rPr>
-        <w:t>31st May 2025</w:t>
+        <w:t>?????</w:t>
       </w:r>
     </w:p>
     <w:p>
@@ -228,7 +229,7 @@
                 <w:szCs w:val="28"/>
                 <w:lang w:val="it-IT" w:bidi="ta-IN"/>
               </w:rPr>
-              <w:t>2.3</w:t>
+              <w:t>1.1</w:t>
             </w:r>
             <w:r>
               <w:rPr>
@@ -270,7 +271,7 @@
                 <w:szCs w:val="28"/>
                 <w:lang w:val="it-IT" w:bidi="ta-IN"/>
               </w:rPr>
-              <w:t>7</w:t>
+              <w:t>25</w:t>
             </w:r>
           </w:p>
           <w:p>
@@ -302,7 +303,7 @@
                 <w:szCs w:val="28"/>
                 <w:lang w:val="it-IT" w:bidi="ta-IN"/>
               </w:rPr>
-              <w:t>6</w:t>
+              <w:t>1</w:t>
             </w:r>
           </w:p>
         </w:tc>
@@ -328,15 +329,71 @@
                 <w:rFonts w:ascii="BRH Malayalam Extra" w:hAnsi="BRH Malayalam Extra" w:cs="BRH Malayalam Extra"/>
                 <w:sz w:val="40"/>
                 <w:szCs w:val="40"/>
-              </w:rPr>
-            </w:pPr>
-            <w:r>
-              <w:rPr>
-                <w:rFonts w:ascii="BRH Malayalam Extra" w:hAnsi="BRH Malayalam Extra" w:cs="BRH Malayalam Extra"/>
-                <w:sz w:val="40"/>
-                <w:szCs w:val="40"/>
-              </w:rPr>
-              <w:t xml:space="preserve">¥RõxZy—rx | </w:t>
+                <w:lang w:val="it-IT"/>
+              </w:rPr>
+            </w:pPr>
+            <w:r>
+              <w:rPr>
+                <w:rFonts w:ascii="BRH Malayalam Extra" w:hAnsi="BRH Malayalam Extra" w:cs="BRH Malayalam Extra"/>
+                <w:sz w:val="40"/>
+                <w:szCs w:val="40"/>
+                <w:lang w:val="it-IT"/>
+              </w:rPr>
+              <w:t>i£</w:t>
+            </w:r>
+            <w:r>
+              <w:rPr>
+                <w:rFonts w:ascii="BRH Malayalam Extra" w:hAnsi="BRH Malayalam Extra" w:cs="BRH Malayalam Extra"/>
+                <w:sz w:val="34"/>
+                <w:szCs w:val="40"/>
+                <w:lang w:val="it-IT"/>
+              </w:rPr>
+              <w:t>–</w:t>
+            </w:r>
+            <w:r>
+              <w:rPr>
+                <w:rFonts w:ascii="BRH Malayalam Extra" w:hAnsi="BRH Malayalam Extra" w:cs="BRH Malayalam Extra"/>
+                <w:sz w:val="40"/>
+                <w:szCs w:val="40"/>
+                <w:lang w:val="it-IT"/>
+              </w:rPr>
+              <w:t>¥q</w:t>
+            </w:r>
+            <w:r>
+              <w:rPr>
+                <w:rFonts w:ascii="BRH Malayalam Extra" w:hAnsi="BRH Malayalam Extra" w:cs="BRH Malayalam Extra"/>
+                <w:sz w:val="34"/>
+                <w:szCs w:val="40"/>
+                <w:lang w:val="it-IT"/>
+              </w:rPr>
+              <w:t>–</w:t>
+            </w:r>
+            <w:r>
+              <w:rPr>
+                <w:rFonts w:ascii="BRH Malayalam Extra" w:hAnsi="BRH Malayalam Extra" w:cs="BRH Malayalam Extra"/>
+                <w:sz w:val="40"/>
+                <w:szCs w:val="40"/>
+                <w:lang w:val="it-IT"/>
+              </w:rPr>
+              <w:t>Z§ | öZy</w:t>
+            </w:r>
+            <w:r>
+              <w:rPr>
+                <w:rFonts w:ascii="BRH Malayalam Extra" w:hAnsi="BRH Malayalam Extra" w:cs="BRH Malayalam Extra"/>
+                <w:sz w:val="34"/>
+                <w:szCs w:val="40"/>
+                <w:lang w:val="it-IT"/>
+              </w:rPr>
+              <w:t>–</w:t>
+            </w:r>
+            <w:r>
+              <w:rPr>
+                <w:rFonts w:ascii="BRH Malayalam Extra" w:hAnsi="BRH Malayalam Extra" w:cs="BRH Malayalam Extra"/>
+                <w:sz w:val="40"/>
+                <w:szCs w:val="40"/>
+                <w:lang w:val="it-IT"/>
+              </w:rPr>
+              <w:t>ræ¡hx</w:t>
             </w:r>
             <w:r>
               <w:rPr>
@@ -344,24 +401,18 @@
                 <w:sz w:val="40"/>
                 <w:szCs w:val="40"/>
                 <w:highlight w:val="yellow"/>
-              </w:rPr>
-              <w:t>D</w:t>
-            </w:r>
-            <w:r>
-              <w:rPr>
-                <w:rFonts w:ascii="BRH Malayalam Extra" w:hAnsi="BRH Malayalam Extra" w:cs="BRH Malayalam Extra"/>
-                <w:sz w:val="34"/>
-                <w:szCs w:val="40"/>
-              </w:rPr>
-              <w:t>–</w:t>
-            </w:r>
-            <w:r>
-              <w:rPr>
-                <w:rFonts w:ascii="BRH Malayalam Extra" w:hAnsi="BRH Malayalam Extra" w:cs="BRH Malayalam Extra"/>
-                <w:sz w:val="40"/>
-                <w:szCs w:val="40"/>
-              </w:rPr>
-              <w:t>ªÆûxJ |</w:t>
+                <w:lang w:val="it-IT"/>
+              </w:rPr>
+              <w:t>˜J</w:t>
+            </w:r>
+            <w:r>
+              <w:rPr>
+                <w:rFonts w:ascii="BRH Malayalam Extra" w:hAnsi="BRH Malayalam Extra" w:cs="BRH Malayalam Extra"/>
+                <w:sz w:val="40"/>
+                <w:szCs w:val="40"/>
+                <w:lang w:val="it-IT"/>
+              </w:rPr>
+              <w:t xml:space="preserve"> |</w:t>
             </w:r>
           </w:p>
         </w:tc>
@@ -387,15 +438,71 @@
                 <w:rFonts w:ascii="BRH Malayalam Extra" w:hAnsi="BRH Malayalam Extra" w:cs="BRH Malayalam Extra"/>
                 <w:sz w:val="40"/>
                 <w:szCs w:val="40"/>
-              </w:rPr>
-            </w:pPr>
-            <w:r>
-              <w:rPr>
-                <w:rFonts w:ascii="BRH Malayalam Extra" w:hAnsi="BRH Malayalam Extra" w:cs="BRH Malayalam Extra"/>
-                <w:sz w:val="40"/>
-                <w:szCs w:val="40"/>
-              </w:rPr>
-              <w:t xml:space="preserve">¥RõxZy—rx | </w:t>
+                <w:lang w:val="it-IT"/>
+              </w:rPr>
+            </w:pPr>
+            <w:r>
+              <w:rPr>
+                <w:rFonts w:ascii="BRH Malayalam Extra" w:hAnsi="BRH Malayalam Extra" w:cs="BRH Malayalam Extra"/>
+                <w:sz w:val="40"/>
+                <w:szCs w:val="40"/>
+                <w:lang w:val="it-IT"/>
+              </w:rPr>
+              <w:t>i£</w:t>
+            </w:r>
+            <w:r>
+              <w:rPr>
+                <w:rFonts w:ascii="BRH Malayalam Extra" w:hAnsi="BRH Malayalam Extra" w:cs="BRH Malayalam Extra"/>
+                <w:sz w:val="34"/>
+                <w:szCs w:val="40"/>
+                <w:lang w:val="it-IT"/>
+              </w:rPr>
+              <w:t>–</w:t>
+            </w:r>
+            <w:r>
+              <w:rPr>
+                <w:rFonts w:ascii="BRH Malayalam Extra" w:hAnsi="BRH Malayalam Extra" w:cs="BRH Malayalam Extra"/>
+                <w:sz w:val="40"/>
+                <w:szCs w:val="40"/>
+                <w:lang w:val="it-IT"/>
+              </w:rPr>
+              <w:t>¥q</w:t>
+            </w:r>
+            <w:r>
+              <w:rPr>
+                <w:rFonts w:ascii="BRH Malayalam Extra" w:hAnsi="BRH Malayalam Extra" w:cs="BRH Malayalam Extra"/>
+                <w:sz w:val="34"/>
+                <w:szCs w:val="40"/>
+                <w:lang w:val="it-IT"/>
+              </w:rPr>
+              <w:t>–</w:t>
+            </w:r>
+            <w:r>
+              <w:rPr>
+                <w:rFonts w:ascii="BRH Malayalam Extra" w:hAnsi="BRH Malayalam Extra" w:cs="BRH Malayalam Extra"/>
+                <w:sz w:val="40"/>
+                <w:szCs w:val="40"/>
+                <w:lang w:val="it-IT"/>
+              </w:rPr>
+              <w:t>Z§ | öZy</w:t>
+            </w:r>
+            <w:r>
+              <w:rPr>
+                <w:rFonts w:ascii="BRH Malayalam Extra" w:hAnsi="BRH Malayalam Extra" w:cs="BRH Malayalam Extra"/>
+                <w:sz w:val="34"/>
+                <w:szCs w:val="40"/>
+                <w:lang w:val="it-IT"/>
+              </w:rPr>
+              <w:t>–</w:t>
+            </w:r>
+            <w:r>
+              <w:rPr>
+                <w:rFonts w:ascii="BRH Malayalam Extra" w:hAnsi="BRH Malayalam Extra" w:cs="BRH Malayalam Extra"/>
+                <w:sz w:val="40"/>
+                <w:szCs w:val="40"/>
+                <w:lang w:val="it-IT"/>
+              </w:rPr>
+              <w:t>ræ¡</w:t>
             </w:r>
             <w:r>
               <w:rPr>
@@ -403,765 +510,18 @@
                 <w:sz w:val="40"/>
                 <w:szCs w:val="40"/>
                 <w:highlight w:val="green"/>
-                <w:lang w:bidi="ml-IN"/>
-              </w:rPr>
-              <w:t>D¦</w:t>
-            </w:r>
-            <w:r>
-              <w:rPr>
-                <w:rFonts w:ascii="BRH Malayalam Extra" w:hAnsi="BRH Malayalam Extra" w:cs="BRH Malayalam Extra"/>
-                <w:sz w:val="34"/>
-                <w:szCs w:val="40"/>
-              </w:rPr>
-              <w:t>–</w:t>
-            </w:r>
-            <w:r>
-              <w:rPr>
-                <w:rFonts w:ascii="BRH Malayalam Extra" w:hAnsi="BRH Malayalam Extra" w:cs="BRH Malayalam Extra"/>
-                <w:sz w:val="40"/>
-                <w:szCs w:val="40"/>
-              </w:rPr>
-              <w:t>ªÆûxJ |</w:t>
-            </w:r>
-          </w:p>
-        </w:tc>
-      </w:tr>
-      <w:tr>
-        <w:trPr>
-          <w:trHeight w:val="1389"/>
-        </w:trPr>
-        <w:tc>
-          <w:tcPr>
-            <w:tcW w:w="3168" w:type="dxa"/>
-            <w:tcBorders>
-              <w:top w:val="single" w:sz="4" w:space="0" w:color="000000"/>
-              <w:left w:val="single" w:sz="4" w:space="0" w:color="000000"/>
-              <w:bottom w:val="single" w:sz="4" w:space="0" w:color="000000"/>
-              <w:right w:val="single" w:sz="4" w:space="0" w:color="000000"/>
-            </w:tcBorders>
-          </w:tcPr>
-          <w:p>
-            <w:pPr>
-              <w:spacing w:before="0" w:line="240" w:lineRule="auto"/>
-              <w:rPr>
-                <w:rFonts w:cs="Latha"/>
-                <w:b/>
-                <w:sz w:val="28"/>
-                <w:szCs w:val="28"/>
-                <w:lang w:val="it-IT" w:bidi="ta-IN"/>
-              </w:rPr>
-            </w:pPr>
-            <w:r>
-              <w:rPr>
-                <w:rFonts w:cs="Latha"/>
-                <w:b/>
-                <w:sz w:val="28"/>
-                <w:szCs w:val="28"/>
-                <w:lang w:val="it-IT" w:bidi="ta-IN"/>
-              </w:rPr>
-              <w:t>5.7.</w:t>
-            </w:r>
-            <w:r>
-              <w:rPr>
-                <w:rFonts w:cs="Latha"/>
-                <w:b/>
-                <w:sz w:val="28"/>
-                <w:szCs w:val="28"/>
-                <w:lang w:val="it-IT" w:bidi="ta-IN"/>
-              </w:rPr>
-              <w:t>4.1</w:t>
-            </w:r>
-            <w:r>
-              <w:rPr>
-                <w:rFonts w:cs="Latha"/>
-                <w:b/>
-                <w:sz w:val="28"/>
-                <w:szCs w:val="28"/>
-                <w:lang w:val="it-IT" w:bidi="ta-IN"/>
-              </w:rPr>
-              <w:t xml:space="preserve"> – Padam</w:t>
-            </w:r>
-          </w:p>
-          <w:p>
-            <w:pPr>
-              <w:spacing w:before="0" w:line="240" w:lineRule="auto"/>
-              <w:rPr>
-                <w:rFonts w:cs="Latha"/>
-                <w:b/>
-                <w:sz w:val="28"/>
-                <w:szCs w:val="28"/>
-                <w:lang w:val="it-IT" w:bidi="ta-IN"/>
-              </w:rPr>
-            </w:pPr>
-            <w:r>
-              <w:rPr>
-                <w:rFonts w:cs="Latha"/>
-                <w:b/>
-                <w:sz w:val="28"/>
-                <w:szCs w:val="28"/>
-                <w:lang w:val="it-IT" w:bidi="ta-IN"/>
-              </w:rPr>
-              <w:t xml:space="preserve">Padam No. - </w:t>
-            </w:r>
-            <w:r>
-              <w:rPr>
-                <w:rFonts w:cs="Latha"/>
-                <w:b/>
-                <w:sz w:val="28"/>
-                <w:szCs w:val="28"/>
-                <w:lang w:val="it-IT" w:bidi="ta-IN"/>
-              </w:rPr>
-              <w:t>12</w:t>
-            </w:r>
-          </w:p>
-          <w:p>
-            <w:pPr>
-              <w:spacing w:before="0" w:line="240" w:lineRule="auto"/>
-              <w:rPr>
-                <w:rFonts w:cs="Latha"/>
-                <w:sz w:val="28"/>
-                <w:szCs w:val="28"/>
-                <w:lang w:val="it-IT" w:bidi="ta-IN"/>
-              </w:rPr>
-            </w:pPr>
-            <w:r>
-              <w:rPr>
-                <w:rFonts w:cs="Latha"/>
-                <w:b/>
-                <w:sz w:val="28"/>
-                <w:szCs w:val="28"/>
-                <w:lang w:val="it-IT" w:bidi="ta-IN"/>
-              </w:rPr>
-              <w:t xml:space="preserve">Panchaati  No. -  </w:t>
-            </w:r>
-            <w:r>
-              <w:rPr>
-                <w:rFonts w:cs="Latha"/>
-                <w:b/>
-                <w:sz w:val="28"/>
-                <w:szCs w:val="28"/>
-                <w:lang w:val="it-IT" w:bidi="ta-IN"/>
-              </w:rPr>
-              <w:t>13</w:t>
-            </w:r>
-          </w:p>
-        </w:tc>
-        <w:tc>
-          <w:tcPr>
-            <w:tcW w:w="4820" w:type="dxa"/>
-            <w:tcBorders>
-              <w:top w:val="single" w:sz="4" w:space="0" w:color="000000"/>
-              <w:left w:val="single" w:sz="4" w:space="0" w:color="000000"/>
-              <w:bottom w:val="single" w:sz="4" w:space="0" w:color="000000"/>
-              <w:right w:val="single" w:sz="4" w:space="0" w:color="000000"/>
-            </w:tcBorders>
-          </w:tcPr>
-          <w:p>
-            <w:pPr>
-              <w:spacing w:before="0" w:line="240" w:lineRule="auto"/>
-              <w:ind w:left="132" w:right="-108"/>
-              <w:rPr>
-                <w:rFonts w:ascii="BRH Malayalam Extra" w:hAnsi="BRH Malayalam Extra" w:cs="BRH Malayalam Extra"/>
-                <w:sz w:val="40"/>
-                <w:szCs w:val="40"/>
-              </w:rPr>
-            </w:pPr>
-            <w:r>
-              <w:rPr>
-                <w:rFonts w:ascii="BRH Malayalam Extra" w:hAnsi="BRH Malayalam Extra" w:cs="BRH Malayalam Extra"/>
-                <w:sz w:val="40"/>
-                <w:szCs w:val="40"/>
-              </w:rPr>
-              <w:t>¤¤p</w:t>
-            </w:r>
-            <w:r>
-              <w:rPr>
-                <w:rFonts w:ascii="BRH Malayalam Extra" w:hAnsi="BRH Malayalam Extra" w:cs="BRH Malayalam Extra"/>
-                <w:sz w:val="34"/>
-                <w:szCs w:val="40"/>
-              </w:rPr>
-              <w:t>–</w:t>
-            </w:r>
-            <w:r>
-              <w:rPr>
-                <w:rFonts w:ascii="BRH Malayalam Extra" w:hAnsi="BRH Malayalam Extra" w:cs="BRH Malayalam Extra"/>
-                <w:sz w:val="40"/>
-                <w:szCs w:val="40"/>
-              </w:rPr>
-              <w:t>qû</w:t>
-            </w:r>
-            <w:r>
-              <w:rPr>
-                <w:rFonts w:ascii="BRH Malayalam Extra" w:hAnsi="BRH Malayalam Extra" w:cs="BRH Malayalam Extra"/>
-                <w:sz w:val="34"/>
-                <w:szCs w:val="40"/>
-              </w:rPr>
-              <w:t>–</w:t>
-            </w:r>
-            <w:r>
-              <w:rPr>
-                <w:rFonts w:ascii="BRH Malayalam Extra" w:hAnsi="BRH Malayalam Extra" w:cs="BRH Malayalam Extra"/>
-                <w:sz w:val="40"/>
-                <w:szCs w:val="40"/>
-                <w:highlight w:val="yellow"/>
-              </w:rPr>
-              <w:t>K</w:t>
-            </w:r>
-            <w:r>
-              <w:rPr>
-                <w:rFonts w:ascii="BRH Malayalam Extra" w:hAnsi="BRH Malayalam Extra" w:cs="BRH Malayalam Extra"/>
-                <w:sz w:val="40"/>
-                <w:szCs w:val="40"/>
-              </w:rPr>
-              <w:t>ªi</w:t>
-            </w:r>
-            <w:r>
-              <w:rPr>
-                <w:rFonts w:ascii="BRH Malayalam Extra" w:hAnsi="BRH Malayalam Extra" w:cs="BRH Malayalam Extra"/>
-                <w:sz w:val="34"/>
-                <w:szCs w:val="40"/>
-              </w:rPr>
-              <w:t>–</w:t>
-            </w:r>
-            <w:r>
-              <w:rPr>
-                <w:rFonts w:ascii="BRH Malayalam Extra" w:hAnsi="BRH Malayalam Extra" w:cs="BRH Malayalam Extra"/>
-                <w:sz w:val="40"/>
-                <w:szCs w:val="40"/>
-              </w:rPr>
-              <w:t xml:space="preserve">YzZy— </w:t>
-            </w:r>
-          </w:p>
-          <w:p>
-            <w:pPr>
-              <w:spacing w:before="0" w:line="240" w:lineRule="auto"/>
-              <w:ind w:left="132" w:right="-108"/>
-              <w:rPr>
-                <w:rFonts w:ascii="BRH Devanagari Extra" w:hAnsi="BRH Devanagari Extra" w:cs="BRH Devanagari Extra"/>
-                <w:sz w:val="40"/>
-                <w:szCs w:val="40"/>
-                <w:lang w:val="it-IT"/>
-              </w:rPr>
-            </w:pPr>
-            <w:r>
-              <w:rPr>
-                <w:rFonts w:ascii="BRH Malayalam Extra" w:hAnsi="BRH Malayalam Extra" w:cs="BRH Malayalam Extra"/>
-                <w:sz w:val="40"/>
-                <w:szCs w:val="40"/>
-              </w:rPr>
-              <w:t>¤¤pqû - K</w:t>
-            </w:r>
-            <w:r>
-              <w:rPr>
-                <w:rFonts w:ascii="BRH Malayalam Extra" w:hAnsi="BRH Malayalam Extra" w:cs="BRH Malayalam Extra"/>
-                <w:sz w:val="34"/>
-                <w:szCs w:val="40"/>
-              </w:rPr>
-              <w:t>–</w:t>
-            </w:r>
-            <w:r>
-              <w:rPr>
-                <w:rFonts w:ascii="BRH Malayalam Extra" w:hAnsi="BRH Malayalam Extra" w:cs="BRH Malayalam Extra"/>
-                <w:sz w:val="40"/>
-                <w:szCs w:val="40"/>
-              </w:rPr>
-              <w:t>ªi</w:t>
-            </w:r>
-            <w:r>
-              <w:rPr>
-                <w:rFonts w:ascii="BRH Malayalam Extra" w:hAnsi="BRH Malayalam Extra" w:cs="BRH Malayalam Extra"/>
-                <w:sz w:val="34"/>
-                <w:szCs w:val="40"/>
-              </w:rPr>
-              <w:t>–</w:t>
-            </w:r>
-            <w:r>
-              <w:rPr>
-                <w:rFonts w:ascii="BRH Malayalam Extra" w:hAnsi="BRH Malayalam Extra" w:cs="BRH Malayalam Extra"/>
-                <w:sz w:val="40"/>
-                <w:szCs w:val="40"/>
-              </w:rPr>
-              <w:t>Yz | d |</w:t>
-            </w:r>
-          </w:p>
-        </w:tc>
-        <w:tc>
-          <w:tcPr>
-            <w:tcW w:w="4961" w:type="dxa"/>
-            <w:tcBorders>
-              <w:top w:val="single" w:sz="4" w:space="0" w:color="000000"/>
-              <w:left w:val="single" w:sz="4" w:space="0" w:color="000000"/>
-              <w:bottom w:val="single" w:sz="4" w:space="0" w:color="000000"/>
-              <w:right w:val="single" w:sz="4" w:space="0" w:color="000000"/>
-            </w:tcBorders>
-          </w:tcPr>
-          <w:p>
-            <w:pPr>
-              <w:spacing w:before="0" w:line="240" w:lineRule="auto"/>
-              <w:ind w:left="132" w:right="-108"/>
-              <w:rPr>
-                <w:rFonts w:ascii="BRH Malayalam Extra" w:hAnsi="BRH Malayalam Extra" w:cs="BRH Malayalam Extra"/>
-                <w:sz w:val="40"/>
-                <w:szCs w:val="40"/>
-              </w:rPr>
-            </w:pPr>
-            <w:r>
-              <w:rPr>
-                <w:rFonts w:ascii="BRH Malayalam Extra" w:hAnsi="BRH Malayalam Extra" w:cs="BRH Malayalam Extra"/>
-                <w:sz w:val="40"/>
-                <w:szCs w:val="40"/>
-              </w:rPr>
-              <w:t>¤¤p</w:t>
-            </w:r>
-            <w:r>
-              <w:rPr>
-                <w:rFonts w:ascii="BRH Malayalam Extra" w:hAnsi="BRH Malayalam Extra" w:cs="BRH Malayalam Extra"/>
-                <w:sz w:val="34"/>
-                <w:szCs w:val="40"/>
-              </w:rPr>
-              <w:t>–</w:t>
-            </w:r>
-            <w:r>
-              <w:rPr>
-                <w:rFonts w:ascii="BRH Malayalam Extra" w:hAnsi="BRH Malayalam Extra" w:cs="BRH Malayalam Extra"/>
-                <w:sz w:val="40"/>
-                <w:szCs w:val="40"/>
-              </w:rPr>
-              <w:t>qû</w:t>
-            </w:r>
-            <w:r>
-              <w:rPr>
-                <w:rFonts w:ascii="BRH Malayalam Extra" w:hAnsi="BRH Malayalam Extra" w:cs="BRH Malayalam Extra"/>
-                <w:sz w:val="34"/>
-                <w:szCs w:val="40"/>
-              </w:rPr>
-              <w:t>–</w:t>
-            </w:r>
-            <w:r>
-              <w:rPr>
-                <w:rFonts w:ascii="BRH Malayalam Extra" w:hAnsi="BRH Malayalam Extra" w:cs="BRH Malayalam Extra"/>
-                <w:sz w:val="40"/>
-                <w:szCs w:val="40"/>
-                <w:highlight w:val="green"/>
-              </w:rPr>
-              <w:t>K</w:t>
-            </w:r>
-            <w:r>
-              <w:rPr>
-                <w:rFonts w:ascii="BRH Malayalam Extra" w:hAnsi="BRH Malayalam Extra" w:cs="BRH Malayalam Extra"/>
-                <w:sz w:val="34"/>
-                <w:szCs w:val="40"/>
-              </w:rPr>
-              <w:t>–</w:t>
-            </w:r>
-            <w:r>
-              <w:rPr>
-                <w:rFonts w:ascii="BRH Malayalam Extra" w:hAnsi="BRH Malayalam Extra" w:cs="BRH Malayalam Extra"/>
-                <w:sz w:val="40"/>
-                <w:szCs w:val="40"/>
-              </w:rPr>
-              <w:t>ªi</w:t>
-            </w:r>
-            <w:r>
-              <w:rPr>
-                <w:rFonts w:ascii="BRH Malayalam Extra" w:hAnsi="BRH Malayalam Extra" w:cs="BRH Malayalam Extra"/>
-                <w:sz w:val="34"/>
-                <w:szCs w:val="40"/>
-              </w:rPr>
-              <w:t>–</w:t>
-            </w:r>
-            <w:r>
-              <w:rPr>
-                <w:rFonts w:ascii="BRH Malayalam Extra" w:hAnsi="BRH Malayalam Extra" w:cs="BRH Malayalam Extra"/>
-                <w:sz w:val="40"/>
-                <w:szCs w:val="40"/>
-              </w:rPr>
-              <w:t xml:space="preserve">YzZy— </w:t>
-            </w:r>
-          </w:p>
-          <w:p>
-            <w:pPr>
-              <w:spacing w:before="0" w:line="240" w:lineRule="auto"/>
-              <w:rPr>
-                <w:rFonts w:ascii="BRH Devanagari Extra" w:hAnsi="BRH Devanagari Extra" w:cs="BRH Devanagari Extra"/>
-                <w:sz w:val="40"/>
-                <w:szCs w:val="40"/>
-                <w:lang w:val="it-IT"/>
-              </w:rPr>
-            </w:pPr>
-            <w:r>
-              <w:rPr>
-                <w:rFonts w:ascii="BRH Malayalam Extra" w:hAnsi="BRH Malayalam Extra" w:cs="BRH Malayalam Extra"/>
-                <w:sz w:val="40"/>
-                <w:szCs w:val="40"/>
-              </w:rPr>
-              <w:t>¤¤pqû - K</w:t>
-            </w:r>
-            <w:r>
-              <w:rPr>
-                <w:rFonts w:ascii="BRH Malayalam Extra" w:hAnsi="BRH Malayalam Extra" w:cs="BRH Malayalam Extra"/>
-                <w:sz w:val="34"/>
-                <w:szCs w:val="40"/>
-              </w:rPr>
-              <w:t>–</w:t>
-            </w:r>
-            <w:r>
-              <w:rPr>
-                <w:rFonts w:ascii="BRH Malayalam Extra" w:hAnsi="BRH Malayalam Extra" w:cs="BRH Malayalam Extra"/>
-                <w:sz w:val="40"/>
-                <w:szCs w:val="40"/>
-              </w:rPr>
-              <w:t>ªi</w:t>
-            </w:r>
-            <w:r>
-              <w:rPr>
-                <w:rFonts w:ascii="BRH Malayalam Extra" w:hAnsi="BRH Malayalam Extra" w:cs="BRH Malayalam Extra"/>
-                <w:sz w:val="34"/>
-                <w:szCs w:val="40"/>
-              </w:rPr>
-              <w:t>–</w:t>
-            </w:r>
-            <w:r>
-              <w:rPr>
-                <w:rFonts w:ascii="BRH Malayalam Extra" w:hAnsi="BRH Malayalam Extra" w:cs="BRH Malayalam Extra"/>
-                <w:sz w:val="40"/>
-                <w:szCs w:val="40"/>
-              </w:rPr>
-              <w:t>Yz | d |</w:t>
-            </w:r>
-          </w:p>
-        </w:tc>
-      </w:tr>
-      <w:tr>
-        <w:trPr>
-          <w:trHeight w:val="1125"/>
-        </w:trPr>
-        <w:tc>
-          <w:tcPr>
-            <w:tcW w:w="3168" w:type="dxa"/>
-            <w:tcBorders>
-              <w:top w:val="single" w:sz="4" w:space="0" w:color="000000"/>
-              <w:left w:val="single" w:sz="4" w:space="0" w:color="000000"/>
-              <w:bottom w:val="single" w:sz="4" w:space="0" w:color="000000"/>
-              <w:right w:val="single" w:sz="4" w:space="0" w:color="000000"/>
-            </w:tcBorders>
-          </w:tcPr>
-          <w:p>
-            <w:pPr>
-              <w:spacing w:before="0" w:line="240" w:lineRule="auto"/>
-              <w:rPr>
-                <w:rFonts w:cs="Latha"/>
-                <w:b/>
-                <w:sz w:val="28"/>
-                <w:szCs w:val="28"/>
-                <w:lang w:val="it-IT" w:bidi="ta-IN"/>
-              </w:rPr>
-            </w:pPr>
-            <w:r>
-              <w:rPr>
-                <w:rFonts w:cs="Latha"/>
-                <w:b/>
-                <w:sz w:val="28"/>
-                <w:szCs w:val="28"/>
-                <w:lang w:val="it-IT" w:bidi="ta-IN"/>
-              </w:rPr>
-              <w:t>5.7.</w:t>
-            </w:r>
-            <w:r>
-              <w:rPr>
-                <w:rFonts w:cs="Latha"/>
-                <w:b/>
-                <w:sz w:val="28"/>
-                <w:szCs w:val="28"/>
-                <w:lang w:val="it-IT" w:bidi="ta-IN"/>
-              </w:rPr>
-              <w:t>9.3</w:t>
-            </w:r>
-            <w:r>
-              <w:rPr>
-                <w:rFonts w:cs="Latha"/>
-                <w:b/>
-                <w:sz w:val="28"/>
-                <w:szCs w:val="28"/>
-                <w:lang w:val="it-IT" w:bidi="ta-IN"/>
-              </w:rPr>
-              <w:t xml:space="preserve"> – Padam</w:t>
-            </w:r>
-          </w:p>
-          <w:p>
-            <w:pPr>
-              <w:spacing w:before="0" w:line="240" w:lineRule="auto"/>
-              <w:rPr>
-                <w:rFonts w:cs="Latha"/>
-                <w:b/>
-                <w:sz w:val="28"/>
-                <w:szCs w:val="28"/>
-                <w:lang w:val="it-IT" w:bidi="ta-IN"/>
-              </w:rPr>
-            </w:pPr>
-            <w:r>
-              <w:rPr>
-                <w:rFonts w:cs="Latha"/>
-                <w:b/>
-                <w:sz w:val="28"/>
-                <w:szCs w:val="28"/>
-                <w:lang w:val="it-IT" w:bidi="ta-IN"/>
-              </w:rPr>
-              <w:t xml:space="preserve">Padam No. - </w:t>
-            </w:r>
-            <w:r>
-              <w:rPr>
-                <w:rFonts w:cs="Latha"/>
-                <w:b/>
-                <w:sz w:val="28"/>
-                <w:szCs w:val="28"/>
-                <w:lang w:val="it-IT" w:bidi="ta-IN"/>
-              </w:rPr>
-              <w:t>49</w:t>
-            </w:r>
-          </w:p>
-          <w:p>
-            <w:pPr>
-              <w:spacing w:before="0" w:line="240" w:lineRule="auto"/>
-              <w:rPr>
-                <w:rFonts w:cs="Latha"/>
-                <w:b/>
-                <w:sz w:val="28"/>
-                <w:szCs w:val="28"/>
-                <w:lang w:val="it-IT" w:bidi="ta-IN"/>
-              </w:rPr>
-            </w:pPr>
-            <w:r>
-              <w:rPr>
-                <w:rFonts w:cs="Latha"/>
-                <w:b/>
-                <w:sz w:val="28"/>
-                <w:szCs w:val="28"/>
-                <w:lang w:val="it-IT" w:bidi="ta-IN"/>
-              </w:rPr>
-              <w:t xml:space="preserve">Panchaati  No. -  </w:t>
-            </w:r>
-            <w:r>
-              <w:rPr>
-                <w:rFonts w:cs="Latha"/>
-                <w:b/>
-                <w:sz w:val="28"/>
-                <w:szCs w:val="28"/>
-                <w:lang w:val="it-IT" w:bidi="ta-IN"/>
-              </w:rPr>
-              <w:t>38</w:t>
-            </w:r>
-          </w:p>
-        </w:tc>
-        <w:tc>
-          <w:tcPr>
-            <w:tcW w:w="4820" w:type="dxa"/>
-            <w:tcBorders>
-              <w:top w:val="single" w:sz="4" w:space="0" w:color="000000"/>
-              <w:left w:val="single" w:sz="4" w:space="0" w:color="000000"/>
-              <w:bottom w:val="single" w:sz="4" w:space="0" w:color="000000"/>
-              <w:right w:val="single" w:sz="4" w:space="0" w:color="000000"/>
-            </w:tcBorders>
-          </w:tcPr>
-          <w:p>
-            <w:pPr>
-              <w:spacing w:before="0" w:line="240" w:lineRule="auto"/>
-              <w:ind w:left="132" w:right="-108"/>
-              <w:rPr>
-                <w:rFonts w:ascii="BRH Malayalam Extra" w:hAnsi="BRH Malayalam Extra" w:cs="BRH Malayalam Extra"/>
-                <w:sz w:val="40"/>
-                <w:szCs w:val="40"/>
-              </w:rPr>
-            </w:pPr>
-            <w:r>
-              <w:rPr>
-                <w:rFonts w:ascii="BRH Malayalam Extra" w:hAnsi="BRH Malayalam Extra" w:cs="BRH Malayalam Extra"/>
-                <w:sz w:val="40"/>
-                <w:szCs w:val="40"/>
-              </w:rPr>
-              <w:t>¤¤p</w:t>
-            </w:r>
-            <w:r>
-              <w:rPr>
-                <w:rFonts w:ascii="BRH Malayalam Extra" w:hAnsi="BRH Malayalam Extra" w:cs="BRH Malayalam Extra"/>
-                <w:sz w:val="34"/>
-                <w:szCs w:val="40"/>
-              </w:rPr>
-              <w:t>–</w:t>
-            </w:r>
-            <w:r>
-              <w:rPr>
-                <w:rFonts w:ascii="BRH Malayalam Extra" w:hAnsi="BRH Malayalam Extra" w:cs="BRH Malayalam Extra"/>
-                <w:sz w:val="40"/>
-                <w:szCs w:val="40"/>
-              </w:rPr>
-              <w:t>qûx</w:t>
-            </w:r>
-            <w:r>
-              <w:rPr>
-                <w:rFonts w:ascii="BRH Malayalam Extra" w:hAnsi="BRH Malayalam Extra" w:cs="BRH Malayalam Extra"/>
-                <w:sz w:val="34"/>
-                <w:szCs w:val="40"/>
-              </w:rPr>
-              <w:t>–</w:t>
-            </w:r>
-            <w:r>
-              <w:rPr>
-                <w:rFonts w:ascii="BRH Malayalam Extra" w:hAnsi="BRH Malayalam Extra" w:cs="BRH Malayalam Extra"/>
-                <w:sz w:val="40"/>
-                <w:szCs w:val="40"/>
-              </w:rPr>
-              <w:t>d</w:t>
-            </w:r>
-            <w:r>
-              <w:rPr>
-                <w:rFonts w:ascii="BRH Malayalam Extra" w:hAnsi="BRH Malayalam Extra" w:cs="BRH Malayalam Extra"/>
-                <w:sz w:val="34"/>
-                <w:szCs w:val="40"/>
-              </w:rPr>
-              <w:t>–</w:t>
-            </w:r>
-            <w:r>
-              <w:rPr>
-                <w:rFonts w:ascii="BRH Malayalam Extra" w:hAnsi="BRH Malayalam Extra" w:cs="BRH Malayalam Extra"/>
-                <w:sz w:val="40"/>
-                <w:szCs w:val="40"/>
-                <w:highlight w:val="yellow"/>
-              </w:rPr>
-              <w:t>k</w:t>
-            </w:r>
-            <w:r>
-              <w:rPr>
-                <w:rFonts w:ascii="BRH Malayalam Extra" w:hAnsi="BRH Malayalam Extra" w:cs="BRH Malayalam Extra"/>
-                <w:sz w:val="34"/>
-                <w:szCs w:val="40"/>
-                <w:highlight w:val="yellow"/>
-              </w:rPr>
-              <w:t>–</w:t>
-            </w:r>
-            <w:r>
-              <w:rPr>
-                <w:rFonts w:ascii="BRH Malayalam Extra" w:hAnsi="BRH Malayalam Extra" w:cs="BRH Malayalam Extra"/>
-                <w:sz w:val="40"/>
-                <w:szCs w:val="40"/>
-                <w:highlight w:val="yellow"/>
-              </w:rPr>
-              <w:t>J</w:t>
-            </w:r>
-            <w:r>
-              <w:rPr>
-                <w:rFonts w:ascii="BRH Malayalam Extra" w:hAnsi="BRH Malayalam Extra" w:cs="BRH Malayalam Extra"/>
-                <w:sz w:val="40"/>
-                <w:szCs w:val="40"/>
-              </w:rPr>
-              <w:t xml:space="preserve"> | jZ§ | </w:t>
-            </w:r>
-            <w:r>
-              <w:rPr>
-                <w:rFonts w:cs="Arial"/>
-                <w:b/>
-                <w:bCs/>
-                <w:sz w:val="32"/>
-                <w:szCs w:val="36"/>
-              </w:rPr>
-              <w:t>38</w:t>
-            </w:r>
-          </w:p>
-        </w:tc>
-        <w:tc>
-          <w:tcPr>
-            <w:tcW w:w="4961" w:type="dxa"/>
-            <w:tcBorders>
-              <w:top w:val="single" w:sz="4" w:space="0" w:color="000000"/>
-              <w:left w:val="single" w:sz="4" w:space="0" w:color="000000"/>
-              <w:bottom w:val="single" w:sz="4" w:space="0" w:color="000000"/>
-              <w:right w:val="single" w:sz="4" w:space="0" w:color="000000"/>
-            </w:tcBorders>
-          </w:tcPr>
-          <w:p>
-            <w:pPr>
-              <w:spacing w:before="0" w:line="240" w:lineRule="auto"/>
-              <w:ind w:left="132" w:right="-108"/>
-              <w:rPr>
-                <w:rFonts w:ascii="BRH Malayalam Extra" w:hAnsi="BRH Malayalam Extra" w:cs="BRH Malayalam Extra"/>
-                <w:sz w:val="40"/>
-                <w:szCs w:val="40"/>
-              </w:rPr>
-            </w:pPr>
-            <w:r>
-              <w:rPr>
-                <w:rFonts w:ascii="BRH Malayalam Extra" w:hAnsi="BRH Malayalam Extra" w:cs="BRH Malayalam Extra"/>
-                <w:sz w:val="40"/>
-                <w:szCs w:val="40"/>
-              </w:rPr>
-              <w:t>¤¤p</w:t>
-            </w:r>
-            <w:r>
-              <w:rPr>
-                <w:rFonts w:ascii="BRH Malayalam Extra" w:hAnsi="BRH Malayalam Extra" w:cs="BRH Malayalam Extra"/>
-                <w:sz w:val="34"/>
-                <w:szCs w:val="40"/>
-              </w:rPr>
-              <w:t>–</w:t>
-            </w:r>
-            <w:r>
-              <w:rPr>
-                <w:rFonts w:ascii="BRH Malayalam Extra" w:hAnsi="BRH Malayalam Extra" w:cs="BRH Malayalam Extra"/>
-                <w:sz w:val="40"/>
-                <w:szCs w:val="40"/>
-              </w:rPr>
-              <w:t>qûx</w:t>
-            </w:r>
-            <w:r>
-              <w:rPr>
-                <w:rFonts w:ascii="BRH Malayalam Extra" w:hAnsi="BRH Malayalam Extra" w:cs="BRH Malayalam Extra"/>
-                <w:sz w:val="34"/>
-                <w:szCs w:val="40"/>
-              </w:rPr>
-              <w:t>–</w:t>
-            </w:r>
-            <w:r>
-              <w:rPr>
-                <w:rFonts w:ascii="BRH Malayalam Extra" w:hAnsi="BRH Malayalam Extra" w:cs="BRH Malayalam Extra"/>
-                <w:sz w:val="40"/>
-                <w:szCs w:val="40"/>
-              </w:rPr>
-              <w:t>d</w:t>
-            </w:r>
-            <w:r>
-              <w:rPr>
-                <w:rFonts w:ascii="BRH Malayalam Extra" w:hAnsi="BRH Malayalam Extra" w:cs="BRH Malayalam Extra"/>
-                <w:sz w:val="34"/>
-                <w:szCs w:val="40"/>
-              </w:rPr>
-              <w:t>–</w:t>
-            </w:r>
-            <w:r>
-              <w:rPr>
-                <w:rFonts w:ascii="BRH Malayalam Extra" w:hAnsi="BRH Malayalam Extra" w:cs="BRH Malayalam Extra"/>
-                <w:sz w:val="40"/>
-                <w:szCs w:val="40"/>
-                <w:highlight w:val="green"/>
-              </w:rPr>
-              <w:t>kJ</w:t>
-            </w:r>
-            <w:r>
-              <w:rPr>
-                <w:rFonts w:ascii="BRH Malayalam Extra" w:hAnsi="BRH Malayalam Extra" w:cs="BRH Malayalam Extra"/>
-                <w:sz w:val="40"/>
-                <w:szCs w:val="40"/>
-              </w:rPr>
-              <w:t xml:space="preserve"> | jZ§ | </w:t>
-            </w:r>
-            <w:r>
-              <w:rPr>
-                <w:rFonts w:cs="Arial"/>
-                <w:b/>
-                <w:bCs/>
-                <w:sz w:val="32"/>
-                <w:szCs w:val="36"/>
-              </w:rPr>
-              <w:t>38</w:t>
+                <w:lang w:val="it-IT"/>
+              </w:rPr>
+              <w:t>hx</w:t>
+            </w:r>
+            <w:r>
+              <w:rPr>
+                <w:rFonts w:ascii="BRH Malayalam Extra" w:hAnsi="BRH Malayalam Extra" w:cs="BRH Malayalam Extra"/>
+                <w:sz w:val="40"/>
+                <w:szCs w:val="40"/>
+                <w:lang w:val="it-IT"/>
+              </w:rPr>
+              <w:t>˜ |</w:t>
             </w:r>
           </w:p>
         </w:tc>
@@ -1179,17 +539,6 @@
           <w:lang w:val="it-IT"/>
         </w:rPr>
       </w:pPr>
-      <w:r>
-        <w:rPr>
-          <w:b/>
-          <w:bCs/>
-          <w:sz w:val="32"/>
-          <w:szCs w:val="32"/>
-          <w:u w:val="single"/>
-          <w:lang w:val="it-IT"/>
-        </w:rPr>
-        <w:t>==========</w:t>
-      </w:r>
     </w:p>
     <w:p>
       <w:pPr>
@@ -1213,65 +562,49 @@
           <w:sz w:val="32"/>
           <w:szCs w:val="32"/>
           <w:u w:val="single"/>
-          <w:lang w:val="it-IT"/>
         </w:rPr>
       </w:pPr>
-    </w:p>
-    <w:p>
-      <w:pPr>
-        <w:jc w:val="center"/>
+      <w:r>
         <w:rPr>
           <w:b/>
           <w:bCs/>
           <w:sz w:val="32"/>
           <w:szCs w:val="32"/>
           <w:u w:val="single"/>
-          <w:lang w:val="it-IT"/>
-        </w:rPr>
-      </w:pPr>
-    </w:p>
-    <w:p>
-      <w:pPr>
-        <w:jc w:val="center"/>
+        </w:rPr>
+        <w:t>TS Pada Paatam – TS 5.7 Malayalam co</w:t>
+      </w:r>
+      <w:r>
         <w:rPr>
           <w:b/>
           <w:bCs/>
           <w:sz w:val="32"/>
           <w:szCs w:val="32"/>
           <w:u w:val="single"/>
-          <w:lang w:val="it-IT"/>
-        </w:rPr>
-      </w:pPr>
-    </w:p>
-    <w:p>
-      <w:pPr>
-        <w:jc w:val="center"/>
+        </w:rPr>
+        <w:t>rrections –</w:t>
+      </w:r>
+      <w:r>
         <w:rPr>
           <w:b/>
           <w:bCs/>
           <w:sz w:val="32"/>
           <w:szCs w:val="32"/>
           <w:u w:val="single"/>
-          <w:lang w:val="it-IT"/>
-        </w:rPr>
-      </w:pPr>
-    </w:p>
-    <w:p>
-      <w:pPr>
-        <w:jc w:val="center"/>
+        </w:rPr>
+        <w:t xml:space="preserve"> </w:t>
+      </w:r>
+      <w:r>
         <w:rPr>
           <w:b/>
           <w:bCs/>
           <w:sz w:val="32"/>
           <w:szCs w:val="32"/>
           <w:u w:val="single"/>
-          <w:lang w:val="it-IT"/>
-        </w:rPr>
-      </w:pPr>
-    </w:p>
-    <w:p>
-      <w:pPr>
-        <w:jc w:val="center"/>
+        </w:rPr>
+        <w:t xml:space="preserve">Observed till </w:t>
+      </w:r>
+      <w:r>
         <w:rPr>
           <w:b/>
           <w:bCs/>
@@ -1279,57 +612,7 @@
           <w:szCs w:val="32"/>
           <w:u w:val="single"/>
         </w:rPr>
-      </w:pPr>
-      <w:r>
-        <w:rPr>
-          <w:b/>
-          <w:bCs/>
-          <w:sz w:val="32"/>
-          <w:szCs w:val="32"/>
-          <w:u w:val="single"/>
-        </w:rPr>
-        <w:lastRenderedPageBreak/>
-        <w:t>TS Pada Paatam – TS 5.7 Malayalam co</w:t>
-      </w:r>
-      <w:r>
-        <w:rPr>
-          <w:b/>
-          <w:bCs/>
-          <w:sz w:val="32"/>
-          <w:szCs w:val="32"/>
-          <w:u w:val="single"/>
-        </w:rPr>
-        <w:t>rrections –</w:t>
-      </w:r>
-      <w:r>
-        <w:rPr>
-          <w:b/>
-          <w:bCs/>
-          <w:sz w:val="32"/>
-          <w:szCs w:val="32"/>
-          <w:u w:val="single"/>
-        </w:rPr>
-        <w:t xml:space="preserve"> </w:t>
-      </w:r>
-      <w:r>
-        <w:rPr>
-          <w:b/>
-          <w:bCs/>
-          <w:sz w:val="32"/>
-          <w:szCs w:val="32"/>
-          <w:u w:val="single"/>
-        </w:rPr>
-        <w:t xml:space="preserve">Observed till </w:t>
-      </w:r>
-      <w:r>
-        <w:rPr>
-          <w:b/>
-          <w:bCs/>
-          <w:sz w:val="32"/>
-          <w:szCs w:val="32"/>
-          <w:u w:val="single"/>
-        </w:rPr>
-        <w:t>31st May 2021</w:t>
+        <w:t>31st May 2025</w:t>
       </w:r>
     </w:p>
     <w:p>
@@ -1455,7 +738,7 @@
       </w:tr>
       <w:tr>
         <w:trPr>
-          <w:trHeight w:val="964"/>
+          <w:trHeight w:val="1105"/>
         </w:trPr>
         <w:tc>
           <w:tcPr>
@@ -1475,7 +758,7 @@
                 <w:b/>
                 <w:sz w:val="28"/>
                 <w:szCs w:val="28"/>
-                <w:lang w:bidi="ta-IN"/>
+                <w:lang w:val="it-IT" w:bidi="ta-IN"/>
               </w:rPr>
             </w:pPr>
             <w:r>
@@ -1484,9 +767,9 @@
                 <w:b/>
                 <w:sz w:val="28"/>
                 <w:szCs w:val="28"/>
-                <w:lang w:bidi="ta-IN"/>
-              </w:rPr>
-              <w:t>5.7.5.</w:t>
+                <w:lang w:val="it-IT" w:bidi="ta-IN"/>
+              </w:rPr>
+              <w:t>5.7.</w:t>
             </w:r>
             <w:r>
               <w:rPr>
@@ -1494,9 +777,9 @@
                 <w:b/>
                 <w:sz w:val="28"/>
                 <w:szCs w:val="28"/>
-                <w:lang w:bidi="ta-IN"/>
-              </w:rPr>
-              <w:t>3</w:t>
+                <w:lang w:val="it-IT" w:bidi="ta-IN"/>
+              </w:rPr>
+              <w:t>2.3</w:t>
             </w:r>
             <w:r>
               <w:rPr>
@@ -1504,63 +787,63 @@
                 <w:b/>
                 <w:sz w:val="28"/>
                 <w:szCs w:val="28"/>
-                <w:lang w:bidi="ta-IN"/>
-              </w:rPr>
-              <w:t xml:space="preserve"> – </w:t>
-            </w:r>
-            <w:r>
+                <w:lang w:val="it-IT" w:bidi="ta-IN"/>
+              </w:rPr>
+              <w:t xml:space="preserve"> – Padam</w:t>
+            </w:r>
+          </w:p>
+          <w:p>
+            <w:pPr>
+              <w:spacing w:before="0" w:line="240" w:lineRule="auto"/>
               <w:rPr>
                 <w:rFonts w:cs="Latha"/>
                 <w:b/>
                 <w:sz w:val="28"/>
                 <w:szCs w:val="28"/>
-                <w:lang w:bidi="ta-IN"/>
-              </w:rPr>
-              <w:t>Vaakyam</w:t>
-            </w:r>
-          </w:p>
-          <w:p>
-            <w:pPr>
-              <w:spacing w:before="0" w:line="240" w:lineRule="auto"/>
+                <w:lang w:val="it-IT" w:bidi="ta-IN"/>
+              </w:rPr>
+            </w:pPr>
+            <w:r>
               <w:rPr>
                 <w:rFonts w:cs="Latha"/>
                 <w:b/>
                 <w:sz w:val="28"/>
                 <w:szCs w:val="28"/>
-                <w:lang w:bidi="ta-IN"/>
-              </w:rPr>
-            </w:pPr>
-            <w:proofErr w:type="gramStart"/>
+                <w:lang w:val="it-IT" w:bidi="ta-IN"/>
+              </w:rPr>
+              <w:t xml:space="preserve">Padam No. - </w:t>
+            </w:r>
             <w:r>
               <w:rPr>
                 <w:rFonts w:cs="Latha"/>
                 <w:b/>
                 <w:sz w:val="28"/>
                 <w:szCs w:val="28"/>
-                <w:lang w:bidi="ta-IN"/>
-              </w:rPr>
-              <w:t xml:space="preserve">Line </w:t>
-            </w:r>
-            <w:r>
+                <w:lang w:val="it-IT" w:bidi="ta-IN"/>
+              </w:rPr>
+              <w:t>7</w:t>
+            </w:r>
+          </w:p>
+          <w:p>
+            <w:pPr>
+              <w:spacing w:before="0" w:line="240" w:lineRule="auto"/>
               <w:rPr>
                 <w:rFonts w:cs="Latha"/>
                 <w:b/>
                 <w:sz w:val="28"/>
                 <w:szCs w:val="28"/>
-                <w:lang w:bidi="ta-IN"/>
-              </w:rPr>
-              <w:t xml:space="preserve"> No.</w:t>
-            </w:r>
-            <w:proofErr w:type="gramEnd"/>
+                <w:lang w:val="it-IT" w:bidi="ta-IN"/>
+              </w:rPr>
+            </w:pPr>
             <w:r>
               <w:rPr>
                 <w:rFonts w:cs="Latha"/>
                 <w:b/>
                 <w:sz w:val="28"/>
                 <w:szCs w:val="28"/>
-                <w:lang w:bidi="ta-IN"/>
-              </w:rPr>
-              <w:t xml:space="preserve"> </w:t>
+                <w:lang w:val="it-IT" w:bidi="ta-IN"/>
+              </w:rPr>
+              <w:t xml:space="preserve">Panchaati  No. -  </w:t>
             </w:r>
             <w:r>
               <w:rPr>
@@ -1568,85 +851,9 @@
                 <w:b/>
                 <w:sz w:val="28"/>
                 <w:szCs w:val="28"/>
-                <w:lang w:bidi="ta-IN"/>
-              </w:rPr>
-              <w:t>- 1</w:t>
-            </w:r>
-          </w:p>
-          <w:p>
-            <w:pPr>
-              <w:spacing w:before="0" w:line="240" w:lineRule="auto"/>
-              <w:rPr>
-                <w:rFonts w:cs="Latha"/>
-                <w:b/>
-                <w:sz w:val="28"/>
-                <w:szCs w:val="28"/>
-                <w:lang w:bidi="ta-IN"/>
-              </w:rPr>
-            </w:pPr>
-            <w:proofErr w:type="gramStart"/>
-            <w:r>
-              <w:rPr>
-                <w:rFonts w:cs="Latha"/>
-                <w:b/>
-                <w:sz w:val="28"/>
-                <w:szCs w:val="28"/>
-                <w:lang w:bidi="ta-IN"/>
-              </w:rPr>
-              <w:t>Panchaati  No.</w:t>
-            </w:r>
-            <w:proofErr w:type="gramEnd"/>
-            <w:r>
-              <w:rPr>
-                <w:rFonts w:cs="Latha"/>
-                <w:b/>
-                <w:sz w:val="28"/>
-                <w:szCs w:val="28"/>
-                <w:lang w:bidi="ta-IN"/>
-              </w:rPr>
-              <w:t xml:space="preserve"> </w:t>
-            </w:r>
-            <w:proofErr w:type="gramStart"/>
-            <w:r>
-              <w:rPr>
-                <w:rFonts w:cs="Latha"/>
-                <w:b/>
-                <w:sz w:val="28"/>
-                <w:szCs w:val="28"/>
-                <w:lang w:bidi="ta-IN"/>
-              </w:rPr>
-              <w:t xml:space="preserve">- </w:t>
-            </w:r>
-            <w:r>
-              <w:rPr>
-                <w:rFonts w:cs="Latha"/>
-                <w:b/>
-                <w:sz w:val="28"/>
-                <w:szCs w:val="28"/>
-                <w:lang w:bidi="ta-IN"/>
-              </w:rPr>
-              <w:t xml:space="preserve"> </w:t>
-            </w:r>
-            <w:r>
-              <w:rPr>
-                <w:rFonts w:cs="Latha"/>
-                <w:b/>
-                <w:sz w:val="28"/>
-                <w:szCs w:val="28"/>
-                <w:lang w:bidi="ta-IN"/>
-              </w:rPr>
-              <w:t>19</w:t>
-            </w:r>
-            <w:proofErr w:type="gramEnd"/>
-            <w:r>
-              <w:rPr>
-                <w:rFonts w:cs="Latha"/>
-                <w:b/>
-                <w:sz w:val="28"/>
-                <w:szCs w:val="28"/>
-                <w:lang w:bidi="ta-IN"/>
-              </w:rPr>
-              <w:t xml:space="preserve"> </w:t>
+                <w:lang w:val="it-IT" w:bidi="ta-IN"/>
+              </w:rPr>
+              <w:t>6</w:t>
             </w:r>
           </w:p>
         </w:tc>
@@ -1662,21 +869,25 @@
           </w:tcPr>
           <w:p>
             <w:pPr>
-              <w:spacing w:before="0" w:line="240" w:lineRule="auto"/>
-              <w:ind w:left="132" w:right="-108"/>
-              <w:rPr>
-                <w:rFonts w:ascii="BRH Devanagari Extra" w:hAnsi="BRH Devanagari Extra" w:cs="BRH Devanagari Extra"/>
-                <w:sz w:val="40"/>
-                <w:szCs w:val="40"/>
-              </w:rPr>
-            </w:pPr>
-            <w:r>
-              <w:rPr>
-                <w:rFonts w:ascii="BRH Malayalam Extra" w:hAnsi="BRH Malayalam Extra" w:cs="BRH Malayalam Extra"/>
-                <w:sz w:val="40"/>
-                <w:szCs w:val="40"/>
-              </w:rPr>
-              <w:t xml:space="preserve">Bt¡—Zzª </w:t>
+              <w:widowControl w:val="0"/>
+              <w:autoSpaceDE w:val="0"/>
+              <w:autoSpaceDN w:val="0"/>
+              <w:adjustRightInd w:val="0"/>
+              <w:spacing w:line="252" w:lineRule="auto"/>
+              <w:ind w:right="132"/>
+              <w:rPr>
+                <w:rFonts w:ascii="BRH Malayalam Extra" w:hAnsi="BRH Malayalam Extra" w:cs="BRH Malayalam Extra"/>
+                <w:sz w:val="40"/>
+                <w:szCs w:val="40"/>
+              </w:rPr>
+            </w:pPr>
+            <w:r>
+              <w:rPr>
+                <w:rFonts w:ascii="BRH Malayalam Extra" w:hAnsi="BRH Malayalam Extra" w:cs="BRH Malayalam Extra"/>
+                <w:sz w:val="40"/>
+                <w:szCs w:val="40"/>
+              </w:rPr>
+              <w:t xml:space="preserve">¥RõxZy—rx | </w:t>
             </w:r>
             <w:r>
               <w:rPr>
@@ -1685,15 +896,23 @@
                 <w:szCs w:val="40"/>
                 <w:highlight w:val="yellow"/>
               </w:rPr>
-              <w:t>R¡¥</w:t>
-            </w:r>
-            <w:r>
-              <w:rPr>
-                <w:rFonts w:ascii="BRH Malayalam Extra" w:hAnsi="BRH Malayalam Extra" w:cs="BRH Malayalam Extra"/>
-                <w:sz w:val="40"/>
-                <w:szCs w:val="40"/>
-              </w:rPr>
-              <w:t>txZõ—ªKx-</w:t>
+              <w:t>D</w:t>
+            </w:r>
+            <w:r>
+              <w:rPr>
+                <w:rFonts w:ascii="BRH Malayalam Extra" w:hAnsi="BRH Malayalam Extra" w:cs="BRH Malayalam Extra"/>
+                <w:sz w:val="34"/>
+                <w:szCs w:val="40"/>
+              </w:rPr>
+              <w:t>–</w:t>
+            </w:r>
+            <w:r>
+              <w:rPr>
+                <w:rFonts w:ascii="BRH Malayalam Extra" w:hAnsi="BRH Malayalam Extra" w:cs="BRH Malayalam Extra"/>
+                <w:sz w:val="40"/>
+                <w:szCs w:val="40"/>
+              </w:rPr>
+              <w:t>ªÆûxJ |</w:t>
             </w:r>
           </w:p>
         </w:tc>
@@ -1709,20 +928,25 @@
           </w:tcPr>
           <w:p>
             <w:pPr>
-              <w:spacing w:before="0" w:line="240" w:lineRule="auto"/>
-              <w:rPr>
-                <w:rFonts w:ascii="BRH Devanagari Extra" w:hAnsi="BRH Devanagari Extra" w:cs="BRH Devanagari Extra"/>
-                <w:sz w:val="40"/>
-                <w:szCs w:val="40"/>
-              </w:rPr>
-            </w:pPr>
-            <w:r>
-              <w:rPr>
-                <w:rFonts w:ascii="BRH Malayalam Extra" w:hAnsi="BRH Malayalam Extra" w:cs="BRH Malayalam Extra"/>
-                <w:sz w:val="40"/>
-                <w:szCs w:val="40"/>
-              </w:rPr>
-              <w:t xml:space="preserve">Bt¡—Zzª </w:t>
+              <w:widowControl w:val="0"/>
+              <w:autoSpaceDE w:val="0"/>
+              <w:autoSpaceDN w:val="0"/>
+              <w:adjustRightInd w:val="0"/>
+              <w:spacing w:line="252" w:lineRule="auto"/>
+              <w:ind w:right="132"/>
+              <w:rPr>
+                <w:rFonts w:ascii="BRH Malayalam Extra" w:hAnsi="BRH Malayalam Extra" w:cs="BRH Malayalam Extra"/>
+                <w:sz w:val="40"/>
+                <w:szCs w:val="40"/>
+              </w:rPr>
+            </w:pPr>
+            <w:r>
+              <w:rPr>
+                <w:rFonts w:ascii="BRH Malayalam Extra" w:hAnsi="BRH Malayalam Extra" w:cs="BRH Malayalam Extra"/>
+                <w:sz w:val="40"/>
+                <w:szCs w:val="40"/>
+              </w:rPr>
+              <w:t xml:space="preserve">¥RõxZy—rx | </w:t>
             </w:r>
             <w:r>
               <w:rPr>
@@ -1730,8 +954,9 @@
                 <w:sz w:val="40"/>
                 <w:szCs w:val="40"/>
                 <w:highlight w:val="green"/>
-              </w:rPr>
-              <w:t>R¡</w:t>
+                <w:lang w:bidi="ml-IN"/>
+              </w:rPr>
+              <w:t>D¦</w:t>
             </w:r>
             <w:r>
               <w:rPr>
@@ -1747,14 +972,14 @@
                 <w:sz w:val="40"/>
                 <w:szCs w:val="40"/>
               </w:rPr>
-              <w:t>¥txZõ—ªKx-</w:t>
+              <w:t>ªÆûxJ |</w:t>
             </w:r>
           </w:p>
         </w:tc>
       </w:tr>
       <w:tr>
         <w:trPr>
-          <w:trHeight w:val="964"/>
+          <w:trHeight w:val="1389"/>
         </w:trPr>
         <w:tc>
           <w:tcPr>
@@ -1795,7 +1020,7 @@
                 <w:szCs w:val="28"/>
                 <w:lang w:val="it-IT" w:bidi="ta-IN"/>
               </w:rPr>
-              <w:t>8</w:t>
+              <w:t>4.1</w:t>
             </w:r>
             <w:r>
               <w:rPr>
@@ -1805,7 +1030,7 @@
                 <w:szCs w:val="28"/>
                 <w:lang w:val="it-IT" w:bidi="ta-IN"/>
               </w:rPr>
-              <w:t>.3 – Padam</w:t>
+              <w:t xml:space="preserve"> – Padam</w:t>
             </w:r>
           </w:p>
           <w:p>
@@ -1827,18 +1052,28 @@
                 <w:szCs w:val="28"/>
                 <w:lang w:val="it-IT" w:bidi="ta-IN"/>
               </w:rPr>
-              <w:t>Padam No. - 7</w:t>
-            </w:r>
-          </w:p>
-          <w:p>
-            <w:pPr>
-              <w:spacing w:before="0" w:line="240" w:lineRule="auto"/>
-              <w:rPr>
-                <w:rFonts w:cs="Latha"/>
+              <w:t xml:space="preserve">Padam No. - </w:t>
+            </w:r>
+            <w:r>
+              <w:rPr>
+                <w:rFonts w:cs="Latha"/>
+                <w:b/>
                 <w:sz w:val="28"/>
                 <w:szCs w:val="28"/>
                 <w:lang w:val="it-IT" w:bidi="ta-IN"/>
               </w:rPr>
+              <w:t>12</w:t>
+            </w:r>
+          </w:p>
+          <w:p>
+            <w:pPr>
+              <w:spacing w:before="0" w:line="240" w:lineRule="auto"/>
+              <w:rPr>
+                <w:rFonts w:cs="Latha"/>
+                <w:sz w:val="28"/>
+                <w:szCs w:val="28"/>
+                <w:lang w:val="it-IT" w:bidi="ta-IN"/>
+              </w:rPr>
             </w:pPr>
             <w:r>
               <w:rPr>
@@ -1848,7 +1083,17 @@
                 <w:szCs w:val="28"/>
                 <w:lang w:val="it-IT" w:bidi="ta-IN"/>
               </w:rPr>
-              <w:t>Panchaati  No. -  35</w:t>
+              <w:t xml:space="preserve">Panchaati  No. -  </w:t>
+            </w:r>
+            <w:r>
+              <w:rPr>
+                <w:rFonts w:cs="Latha"/>
+                <w:b/>
+                <w:sz w:val="28"/>
+                <w:szCs w:val="28"/>
+                <w:lang w:val="it-IT" w:bidi="ta-IN"/>
+              </w:rPr>
+              <w:t>13</w:t>
             </w:r>
           </w:p>
         </w:tc>
@@ -1867,6 +1112,82 @@
               <w:spacing w:before="0" w:line="240" w:lineRule="auto"/>
               <w:ind w:left="132" w:right="-108"/>
               <w:rPr>
+                <w:rFonts w:ascii="BRH Malayalam Extra" w:hAnsi="BRH Malayalam Extra" w:cs="BRH Malayalam Extra"/>
+                <w:sz w:val="40"/>
+                <w:szCs w:val="40"/>
+              </w:rPr>
+            </w:pPr>
+            <w:r>
+              <w:rPr>
+                <w:rFonts w:ascii="BRH Malayalam Extra" w:hAnsi="BRH Malayalam Extra" w:cs="BRH Malayalam Extra"/>
+                <w:sz w:val="40"/>
+                <w:szCs w:val="40"/>
+              </w:rPr>
+              <w:t>¤¤p</w:t>
+            </w:r>
+            <w:r>
+              <w:rPr>
+                <w:rFonts w:ascii="BRH Malayalam Extra" w:hAnsi="BRH Malayalam Extra" w:cs="BRH Malayalam Extra"/>
+                <w:sz w:val="34"/>
+                <w:szCs w:val="40"/>
+              </w:rPr>
+              <w:t>–</w:t>
+            </w:r>
+            <w:r>
+              <w:rPr>
+                <w:rFonts w:ascii="BRH Malayalam Extra" w:hAnsi="BRH Malayalam Extra" w:cs="BRH Malayalam Extra"/>
+                <w:sz w:val="40"/>
+                <w:szCs w:val="40"/>
+              </w:rPr>
+              <w:t>qû</w:t>
+            </w:r>
+            <w:r>
+              <w:rPr>
+                <w:rFonts w:ascii="BRH Malayalam Extra" w:hAnsi="BRH Malayalam Extra" w:cs="BRH Malayalam Extra"/>
+                <w:sz w:val="34"/>
+                <w:szCs w:val="40"/>
+              </w:rPr>
+              <w:t>–</w:t>
+            </w:r>
+            <w:r>
+              <w:rPr>
+                <w:rFonts w:ascii="BRH Malayalam Extra" w:hAnsi="BRH Malayalam Extra" w:cs="BRH Malayalam Extra"/>
+                <w:sz w:val="40"/>
+                <w:szCs w:val="40"/>
+                <w:highlight w:val="yellow"/>
+              </w:rPr>
+              <w:t>K</w:t>
+            </w:r>
+            <w:r>
+              <w:rPr>
+                <w:rFonts w:ascii="BRH Malayalam Extra" w:hAnsi="BRH Malayalam Extra" w:cs="BRH Malayalam Extra"/>
+                <w:sz w:val="40"/>
+                <w:szCs w:val="40"/>
+              </w:rPr>
+              <w:t>ªi</w:t>
+            </w:r>
+            <w:r>
+              <w:rPr>
+                <w:rFonts w:ascii="BRH Malayalam Extra" w:hAnsi="BRH Malayalam Extra" w:cs="BRH Malayalam Extra"/>
+                <w:sz w:val="34"/>
+                <w:szCs w:val="40"/>
+              </w:rPr>
+              <w:t>–</w:t>
+            </w:r>
+            <w:r>
+              <w:rPr>
+                <w:rFonts w:ascii="BRH Malayalam Extra" w:hAnsi="BRH Malayalam Extra" w:cs="BRH Malayalam Extra"/>
+                <w:sz w:val="40"/>
+                <w:szCs w:val="40"/>
+              </w:rPr>
+              <w:t xml:space="preserve">YzZy— </w:t>
+            </w:r>
+          </w:p>
+          <w:p>
+            <w:pPr>
+              <w:spacing w:before="0" w:line="240" w:lineRule="auto"/>
+              <w:ind w:left="132" w:right="-108"/>
+              <w:rPr>
                 <w:rFonts w:ascii="BRH Devanagari Extra" w:hAnsi="BRH Devanagari Extra" w:cs="BRH Devanagari Extra"/>
                 <w:sz w:val="40"/>
                 <w:szCs w:val="40"/>
@@ -1878,100 +1199,40 @@
                 <w:rFonts w:ascii="BRH Malayalam Extra" w:hAnsi="BRH Malayalam Extra" w:cs="BRH Malayalam Extra"/>
                 <w:sz w:val="40"/>
                 <w:szCs w:val="40"/>
-                <w:lang w:val="it-IT"/>
-              </w:rPr>
-              <w:t>Rx</w:t>
+              </w:rPr>
+              <w:t>¤¤pqû - K</w:t>
             </w:r>
             <w:r>
               <w:rPr>
                 <w:rFonts w:ascii="BRH Malayalam Extra" w:hAnsi="BRH Malayalam Extra" w:cs="BRH Malayalam Extra"/>
                 <w:sz w:val="34"/>
                 <w:szCs w:val="40"/>
-                <w:lang w:val="it-IT"/>
-              </w:rPr>
-              <w:t>–</w:t>
-            </w:r>
-            <w:r>
-              <w:rPr>
-                <w:rFonts w:ascii="BRH Malayalam Extra" w:hAnsi="BRH Malayalam Extra" w:cs="BRH Malayalam Extra"/>
-                <w:sz w:val="40"/>
-                <w:szCs w:val="40"/>
-                <w:lang w:val="it-IT"/>
-              </w:rPr>
-              <w:t>dx</w:t>
+              </w:rPr>
+              <w:t>–</w:t>
+            </w:r>
+            <w:r>
+              <w:rPr>
+                <w:rFonts w:ascii="BRH Malayalam Extra" w:hAnsi="BRH Malayalam Extra" w:cs="BRH Malayalam Extra"/>
+                <w:sz w:val="40"/>
+                <w:szCs w:val="40"/>
+              </w:rPr>
+              <w:t>ªi</w:t>
             </w:r>
             <w:r>
               <w:rPr>
                 <w:rFonts w:ascii="BRH Malayalam Extra" w:hAnsi="BRH Malayalam Extra" w:cs="BRH Malayalam Extra"/>
                 <w:sz w:val="34"/>
                 <w:szCs w:val="40"/>
-                <w:lang w:val="it-IT"/>
-              </w:rPr>
-              <w:t>–</w:t>
-            </w:r>
-            <w:r>
-              <w:rPr>
-                <w:rFonts w:ascii="BRH Malayalam Extra" w:hAnsi="BRH Malayalam Extra" w:cs="BRH Malayalam Extra"/>
-                <w:sz w:val="40"/>
-                <w:szCs w:val="40"/>
-                <w:lang w:val="it-IT"/>
-              </w:rPr>
-              <w:t>Zy</w:t>
-            </w:r>
-            <w:r>
-              <w:rPr>
-                <w:rFonts w:ascii="BRH Malayalam Extra" w:hAnsi="BRH Malayalam Extra" w:cs="BRH Malayalam Extra"/>
-                <w:sz w:val="34"/>
-                <w:szCs w:val="40"/>
-                <w:lang w:val="it-IT"/>
-              </w:rPr>
-              <w:t>–</w:t>
-            </w:r>
-            <w:r>
-              <w:rPr>
-                <w:rFonts w:ascii="BRH Malayalam Extra" w:hAnsi="BRH Malayalam Extra" w:cs="BRH Malayalam Extra"/>
-                <w:sz w:val="40"/>
-                <w:szCs w:val="40"/>
-                <w:lang w:val="it-IT"/>
-              </w:rPr>
-              <w:t xml:space="preserve"> | C</w:t>
-            </w:r>
-            <w:r>
-              <w:rPr>
-                <w:rFonts w:ascii="BRH Malayalam Extra" w:hAnsi="BRH Malayalam Extra" w:cs="BRH Malayalam Extra"/>
-                <w:sz w:val="34"/>
-                <w:szCs w:val="40"/>
-                <w:lang w:val="it-IT"/>
-              </w:rPr>
-              <w:t>–</w:t>
-            </w:r>
-            <w:r>
-              <w:rPr>
-                <w:rFonts w:ascii="BRH Malayalam Extra" w:hAnsi="BRH Malayalam Extra" w:cs="BRH Malayalam Extra"/>
-                <w:sz w:val="40"/>
-                <w:szCs w:val="40"/>
-                <w:lang w:val="it-IT"/>
-              </w:rPr>
-              <w:t xml:space="preserve">iI | </w:t>
-            </w:r>
-            <w:r>
-              <w:rPr>
-                <w:rFonts w:ascii="BRH Malayalam Extra" w:hAnsi="BRH Malayalam Extra" w:cs="BRH Malayalam Extra"/>
-                <w:sz w:val="40"/>
-                <w:szCs w:val="40"/>
-                <w:highlight w:val="yellow"/>
-                <w:lang w:val="it-IT"/>
-              </w:rPr>
-              <w:t>dJ</w:t>
-            </w:r>
-            <w:r>
-              <w:rPr>
-                <w:rFonts w:ascii="BRH Malayalam Extra" w:hAnsi="BRH Malayalam Extra" w:cs="BRH Malayalam Extra"/>
-                <w:sz w:val="40"/>
-                <w:szCs w:val="40"/>
-                <w:lang w:val="it-IT"/>
-              </w:rPr>
-              <w:t xml:space="preserve"> |</w:t>
+              </w:rPr>
+              <w:t>–</w:t>
+            </w:r>
+            <w:r>
+              <w:rPr>
+                <w:rFonts w:ascii="BRH Malayalam Extra" w:hAnsi="BRH Malayalam Extra" w:cs="BRH Malayalam Extra"/>
+                <w:sz w:val="40"/>
+                <w:szCs w:val="40"/>
+              </w:rPr>
+              <w:t>Yz | d |</w:t>
             </w:r>
           </w:p>
         </w:tc>
@@ -1988,6 +1249,90 @@
           <w:p>
             <w:pPr>
               <w:spacing w:before="0" w:line="240" w:lineRule="auto"/>
+              <w:ind w:left="132" w:right="-108"/>
+              <w:rPr>
+                <w:rFonts w:ascii="BRH Malayalam Extra" w:hAnsi="BRH Malayalam Extra" w:cs="BRH Malayalam Extra"/>
+                <w:sz w:val="40"/>
+                <w:szCs w:val="40"/>
+              </w:rPr>
+            </w:pPr>
+            <w:r>
+              <w:rPr>
+                <w:rFonts w:ascii="BRH Malayalam Extra" w:hAnsi="BRH Malayalam Extra" w:cs="BRH Malayalam Extra"/>
+                <w:sz w:val="40"/>
+                <w:szCs w:val="40"/>
+              </w:rPr>
+              <w:t>¤¤p</w:t>
+            </w:r>
+            <w:r>
+              <w:rPr>
+                <w:rFonts w:ascii="BRH Malayalam Extra" w:hAnsi="BRH Malayalam Extra" w:cs="BRH Malayalam Extra"/>
+                <w:sz w:val="34"/>
+                <w:szCs w:val="40"/>
+              </w:rPr>
+              <w:t>–</w:t>
+            </w:r>
+            <w:r>
+              <w:rPr>
+                <w:rFonts w:ascii="BRH Malayalam Extra" w:hAnsi="BRH Malayalam Extra" w:cs="BRH Malayalam Extra"/>
+                <w:sz w:val="40"/>
+                <w:szCs w:val="40"/>
+              </w:rPr>
+              <w:t>qû</w:t>
+            </w:r>
+            <w:r>
+              <w:rPr>
+                <w:rFonts w:ascii="BRH Malayalam Extra" w:hAnsi="BRH Malayalam Extra" w:cs="BRH Malayalam Extra"/>
+                <w:sz w:val="34"/>
+                <w:szCs w:val="40"/>
+              </w:rPr>
+              <w:t>–</w:t>
+            </w:r>
+            <w:r>
+              <w:rPr>
+                <w:rFonts w:ascii="BRH Malayalam Extra" w:hAnsi="BRH Malayalam Extra" w:cs="BRH Malayalam Extra"/>
+                <w:sz w:val="40"/>
+                <w:szCs w:val="40"/>
+                <w:highlight w:val="green"/>
+              </w:rPr>
+              <w:t>K</w:t>
+            </w:r>
+            <w:r>
+              <w:rPr>
+                <w:rFonts w:ascii="BRH Malayalam Extra" w:hAnsi="BRH Malayalam Extra" w:cs="BRH Malayalam Extra"/>
+                <w:sz w:val="34"/>
+                <w:szCs w:val="40"/>
+              </w:rPr>
+              <w:t>–</w:t>
+            </w:r>
+            <w:r>
+              <w:rPr>
+                <w:rFonts w:ascii="BRH Malayalam Extra" w:hAnsi="BRH Malayalam Extra" w:cs="BRH Malayalam Extra"/>
+                <w:sz w:val="40"/>
+                <w:szCs w:val="40"/>
+              </w:rPr>
+              <w:t>ªi</w:t>
+            </w:r>
+            <w:r>
+              <w:rPr>
+                <w:rFonts w:ascii="BRH Malayalam Extra" w:hAnsi="BRH Malayalam Extra" w:cs="BRH Malayalam Extra"/>
+                <w:sz w:val="34"/>
+                <w:szCs w:val="40"/>
+              </w:rPr>
+              <w:t>–</w:t>
+            </w:r>
+            <w:r>
+              <w:rPr>
+                <w:rFonts w:ascii="BRH Malayalam Extra" w:hAnsi="BRH Malayalam Extra" w:cs="BRH Malayalam Extra"/>
+                <w:sz w:val="40"/>
+                <w:szCs w:val="40"/>
+              </w:rPr>
+              <w:t xml:space="preserve">YzZy— </w:t>
+            </w:r>
+          </w:p>
+          <w:p>
+            <w:pPr>
+              <w:spacing w:before="0" w:line="240" w:lineRule="auto"/>
               <w:rPr>
                 <w:rFonts w:ascii="BRH Devanagari Extra" w:hAnsi="BRH Devanagari Extra" w:cs="BRH Devanagari Extra"/>
                 <w:sz w:val="40"/>
@@ -2000,81 +1345,348 @@
                 <w:rFonts w:ascii="BRH Malayalam Extra" w:hAnsi="BRH Malayalam Extra" w:cs="BRH Malayalam Extra"/>
                 <w:sz w:val="40"/>
                 <w:szCs w:val="40"/>
-                <w:lang w:val="it-IT"/>
-              </w:rPr>
-              <w:t>Rx</w:t>
+              </w:rPr>
+              <w:t>¤¤pqû - K</w:t>
             </w:r>
             <w:r>
               <w:rPr>
                 <w:rFonts w:ascii="BRH Malayalam Extra" w:hAnsi="BRH Malayalam Extra" w:cs="BRH Malayalam Extra"/>
                 <w:sz w:val="34"/>
                 <w:szCs w:val="40"/>
-                <w:lang w:val="it-IT"/>
-              </w:rPr>
-              <w:t>–</w:t>
-            </w:r>
-            <w:r>
-              <w:rPr>
-                <w:rFonts w:ascii="BRH Malayalam Extra" w:hAnsi="BRH Malayalam Extra" w:cs="BRH Malayalam Extra"/>
-                <w:sz w:val="40"/>
-                <w:szCs w:val="40"/>
-                <w:lang w:val="it-IT"/>
-              </w:rPr>
-              <w:t>dx</w:t>
+              </w:rPr>
+              <w:t>–</w:t>
+            </w:r>
+            <w:r>
+              <w:rPr>
+                <w:rFonts w:ascii="BRH Malayalam Extra" w:hAnsi="BRH Malayalam Extra" w:cs="BRH Malayalam Extra"/>
+                <w:sz w:val="40"/>
+                <w:szCs w:val="40"/>
+              </w:rPr>
+              <w:t>ªi</w:t>
             </w:r>
             <w:r>
               <w:rPr>
                 <w:rFonts w:ascii="BRH Malayalam Extra" w:hAnsi="BRH Malayalam Extra" w:cs="BRH Malayalam Extra"/>
                 <w:sz w:val="34"/>
                 <w:szCs w:val="40"/>
-                <w:lang w:val="it-IT"/>
-              </w:rPr>
-              <w:t>–</w:t>
-            </w:r>
-            <w:r>
-              <w:rPr>
-                <w:rFonts w:ascii="BRH Malayalam Extra" w:hAnsi="BRH Malayalam Extra" w:cs="BRH Malayalam Extra"/>
-                <w:sz w:val="40"/>
-                <w:szCs w:val="40"/>
-                <w:lang w:val="it-IT"/>
-              </w:rPr>
-              <w:t>Zy</w:t>
+              </w:rPr>
+              <w:t>–</w:t>
+            </w:r>
+            <w:r>
+              <w:rPr>
+                <w:rFonts w:ascii="BRH Malayalam Extra" w:hAnsi="BRH Malayalam Extra" w:cs="BRH Malayalam Extra"/>
+                <w:sz w:val="40"/>
+                <w:szCs w:val="40"/>
+              </w:rPr>
+              <w:t>Yz | d |</w:t>
+            </w:r>
+          </w:p>
+        </w:tc>
+      </w:tr>
+      <w:tr>
+        <w:trPr>
+          <w:trHeight w:val="1125"/>
+        </w:trPr>
+        <w:tc>
+          <w:tcPr>
+            <w:tcW w:w="3168" w:type="dxa"/>
+            <w:tcBorders>
+              <w:top w:val="single" w:sz="4" w:space="0" w:color="000000"/>
+              <w:left w:val="single" w:sz="4" w:space="0" w:color="000000"/>
+              <w:bottom w:val="single" w:sz="4" w:space="0" w:color="000000"/>
+              <w:right w:val="single" w:sz="4" w:space="0" w:color="000000"/>
+            </w:tcBorders>
+          </w:tcPr>
+          <w:p>
+            <w:pPr>
+              <w:spacing w:before="0" w:line="240" w:lineRule="auto"/>
+              <w:rPr>
+                <w:rFonts w:cs="Latha"/>
+                <w:b/>
+                <w:sz w:val="28"/>
+                <w:szCs w:val="28"/>
+                <w:lang w:val="it-IT" w:bidi="ta-IN"/>
+              </w:rPr>
+            </w:pPr>
+            <w:r>
+              <w:rPr>
+                <w:rFonts w:cs="Latha"/>
+                <w:b/>
+                <w:sz w:val="28"/>
+                <w:szCs w:val="28"/>
+                <w:lang w:val="it-IT" w:bidi="ta-IN"/>
+              </w:rPr>
+              <w:lastRenderedPageBreak/>
+              <w:t>5.7.</w:t>
+            </w:r>
+            <w:r>
+              <w:rPr>
+                <w:rFonts w:cs="Latha"/>
+                <w:b/>
+                <w:sz w:val="28"/>
+                <w:szCs w:val="28"/>
+                <w:lang w:val="it-IT" w:bidi="ta-IN"/>
+              </w:rPr>
+              <w:t>9.3</w:t>
+            </w:r>
+            <w:r>
+              <w:rPr>
+                <w:rFonts w:cs="Latha"/>
+                <w:b/>
+                <w:sz w:val="28"/>
+                <w:szCs w:val="28"/>
+                <w:lang w:val="it-IT" w:bidi="ta-IN"/>
+              </w:rPr>
+              <w:t xml:space="preserve"> – Padam</w:t>
+            </w:r>
+          </w:p>
+          <w:p>
+            <w:pPr>
+              <w:spacing w:before="0" w:line="240" w:lineRule="auto"/>
+              <w:rPr>
+                <w:rFonts w:cs="Latha"/>
+                <w:b/>
+                <w:sz w:val="28"/>
+                <w:szCs w:val="28"/>
+                <w:lang w:val="it-IT" w:bidi="ta-IN"/>
+              </w:rPr>
+            </w:pPr>
+            <w:r>
+              <w:rPr>
+                <w:rFonts w:cs="Latha"/>
+                <w:b/>
+                <w:sz w:val="28"/>
+                <w:szCs w:val="28"/>
+                <w:lang w:val="it-IT" w:bidi="ta-IN"/>
+              </w:rPr>
+              <w:t xml:space="preserve">Padam No. - </w:t>
+            </w:r>
+            <w:r>
+              <w:rPr>
+                <w:rFonts w:cs="Latha"/>
+                <w:b/>
+                <w:sz w:val="28"/>
+                <w:szCs w:val="28"/>
+                <w:lang w:val="it-IT" w:bidi="ta-IN"/>
+              </w:rPr>
+              <w:t>49</w:t>
+            </w:r>
+          </w:p>
+          <w:p>
+            <w:pPr>
+              <w:spacing w:before="0" w:line="240" w:lineRule="auto"/>
+              <w:rPr>
+                <w:rFonts w:cs="Latha"/>
+                <w:b/>
+                <w:sz w:val="28"/>
+                <w:szCs w:val="28"/>
+                <w:lang w:val="it-IT" w:bidi="ta-IN"/>
+              </w:rPr>
+            </w:pPr>
+            <w:r>
+              <w:rPr>
+                <w:rFonts w:cs="Latha"/>
+                <w:b/>
+                <w:sz w:val="28"/>
+                <w:szCs w:val="28"/>
+                <w:lang w:val="it-IT" w:bidi="ta-IN"/>
+              </w:rPr>
+              <w:t xml:space="preserve">Panchaati  No. -  </w:t>
+            </w:r>
+            <w:r>
+              <w:rPr>
+                <w:rFonts w:cs="Latha"/>
+                <w:b/>
+                <w:sz w:val="28"/>
+                <w:szCs w:val="28"/>
+                <w:lang w:val="it-IT" w:bidi="ta-IN"/>
+              </w:rPr>
+              <w:t>38</w:t>
+            </w:r>
+          </w:p>
+        </w:tc>
+        <w:tc>
+          <w:tcPr>
+            <w:tcW w:w="4820" w:type="dxa"/>
+            <w:tcBorders>
+              <w:top w:val="single" w:sz="4" w:space="0" w:color="000000"/>
+              <w:left w:val="single" w:sz="4" w:space="0" w:color="000000"/>
+              <w:bottom w:val="single" w:sz="4" w:space="0" w:color="000000"/>
+              <w:right w:val="single" w:sz="4" w:space="0" w:color="000000"/>
+            </w:tcBorders>
+          </w:tcPr>
+          <w:p>
+            <w:pPr>
+              <w:spacing w:before="0" w:line="240" w:lineRule="auto"/>
+              <w:ind w:left="132" w:right="-108"/>
+              <w:rPr>
+                <w:rFonts w:ascii="BRH Malayalam Extra" w:hAnsi="BRH Malayalam Extra" w:cs="BRH Malayalam Extra"/>
+                <w:sz w:val="40"/>
+                <w:szCs w:val="40"/>
+              </w:rPr>
+            </w:pPr>
+            <w:r>
+              <w:rPr>
+                <w:rFonts w:ascii="BRH Malayalam Extra" w:hAnsi="BRH Malayalam Extra" w:cs="BRH Malayalam Extra"/>
+                <w:sz w:val="40"/>
+                <w:szCs w:val="40"/>
+              </w:rPr>
+              <w:t>¤¤p</w:t>
             </w:r>
             <w:r>
               <w:rPr>
                 <w:rFonts w:ascii="BRH Malayalam Extra" w:hAnsi="BRH Malayalam Extra" w:cs="BRH Malayalam Extra"/>
                 <w:sz w:val="34"/>
                 <w:szCs w:val="40"/>
-                <w:lang w:val="it-IT"/>
-              </w:rPr>
-              <w:t>–</w:t>
-            </w:r>
-            <w:r>
-              <w:rPr>
-                <w:rFonts w:ascii="BRH Malayalam Extra" w:hAnsi="BRH Malayalam Extra" w:cs="BRH Malayalam Extra"/>
-                <w:sz w:val="40"/>
-                <w:szCs w:val="40"/>
-                <w:lang w:val="it-IT"/>
-              </w:rPr>
-              <w:t xml:space="preserve"> | C</w:t>
+              </w:rPr>
+              <w:t>–</w:t>
+            </w:r>
+            <w:r>
+              <w:rPr>
+                <w:rFonts w:ascii="BRH Malayalam Extra" w:hAnsi="BRH Malayalam Extra" w:cs="BRH Malayalam Extra"/>
+                <w:sz w:val="40"/>
+                <w:szCs w:val="40"/>
+              </w:rPr>
+              <w:t>qûx</w:t>
             </w:r>
             <w:r>
               <w:rPr>
                 <w:rFonts w:ascii="BRH Malayalam Extra" w:hAnsi="BRH Malayalam Extra" w:cs="BRH Malayalam Extra"/>
                 <w:sz w:val="34"/>
                 <w:szCs w:val="40"/>
-                <w:lang w:val="it-IT"/>
-              </w:rPr>
-              <w:t>–</w:t>
-            </w:r>
-            <w:r>
-              <w:rPr>
-                <w:rFonts w:ascii="BRH Malayalam Extra" w:hAnsi="BRH Malayalam Extra" w:cs="BRH Malayalam Extra"/>
-                <w:sz w:val="40"/>
-                <w:szCs w:val="40"/>
-                <w:lang w:val="it-IT"/>
-              </w:rPr>
-              <w:t xml:space="preserve">iI | </w:t>
+              </w:rPr>
+              <w:t>–</w:t>
+            </w:r>
+            <w:r>
+              <w:rPr>
+                <w:rFonts w:ascii="BRH Malayalam Extra" w:hAnsi="BRH Malayalam Extra" w:cs="BRH Malayalam Extra"/>
+                <w:sz w:val="40"/>
+                <w:szCs w:val="40"/>
+              </w:rPr>
+              <w:t>d</w:t>
+            </w:r>
+            <w:r>
+              <w:rPr>
+                <w:rFonts w:ascii="BRH Malayalam Extra" w:hAnsi="BRH Malayalam Extra" w:cs="BRH Malayalam Extra"/>
+                <w:sz w:val="34"/>
+                <w:szCs w:val="40"/>
+              </w:rPr>
+              <w:t>–</w:t>
+            </w:r>
+            <w:r>
+              <w:rPr>
+                <w:rFonts w:ascii="BRH Malayalam Extra" w:hAnsi="BRH Malayalam Extra" w:cs="BRH Malayalam Extra"/>
+                <w:sz w:val="40"/>
+                <w:szCs w:val="40"/>
+                <w:highlight w:val="yellow"/>
+              </w:rPr>
+              <w:t>k</w:t>
+            </w:r>
+            <w:r>
+              <w:rPr>
+                <w:rFonts w:ascii="BRH Malayalam Extra" w:hAnsi="BRH Malayalam Extra" w:cs="BRH Malayalam Extra"/>
+                <w:sz w:val="34"/>
+                <w:szCs w:val="40"/>
+                <w:highlight w:val="yellow"/>
+              </w:rPr>
+              <w:t>–</w:t>
+            </w:r>
+            <w:r>
+              <w:rPr>
+                <w:rFonts w:ascii="BRH Malayalam Extra" w:hAnsi="BRH Malayalam Extra" w:cs="BRH Malayalam Extra"/>
+                <w:sz w:val="40"/>
+                <w:szCs w:val="40"/>
+                <w:highlight w:val="yellow"/>
+              </w:rPr>
+              <w:t>J</w:t>
+            </w:r>
+            <w:r>
+              <w:rPr>
+                <w:rFonts w:ascii="BRH Malayalam Extra" w:hAnsi="BRH Malayalam Extra" w:cs="BRH Malayalam Extra"/>
+                <w:sz w:val="40"/>
+                <w:szCs w:val="40"/>
+              </w:rPr>
+              <w:t xml:space="preserve"> | jZ§ | </w:t>
+            </w:r>
+            <w:r>
+              <w:rPr>
+                <w:rFonts w:cs="Arial"/>
+                <w:b/>
+                <w:bCs/>
+                <w:sz w:val="32"/>
+                <w:szCs w:val="36"/>
+              </w:rPr>
+              <w:t>38</w:t>
+            </w:r>
+          </w:p>
+        </w:tc>
+        <w:tc>
+          <w:tcPr>
+            <w:tcW w:w="4961" w:type="dxa"/>
+            <w:tcBorders>
+              <w:top w:val="single" w:sz="4" w:space="0" w:color="000000"/>
+              <w:left w:val="single" w:sz="4" w:space="0" w:color="000000"/>
+              <w:bottom w:val="single" w:sz="4" w:space="0" w:color="000000"/>
+              <w:right w:val="single" w:sz="4" w:space="0" w:color="000000"/>
+            </w:tcBorders>
+          </w:tcPr>
+          <w:p>
+            <w:pPr>
+              <w:spacing w:before="0" w:line="240" w:lineRule="auto"/>
+              <w:ind w:left="132" w:right="-108"/>
+              <w:rPr>
+                <w:rFonts w:ascii="BRH Malayalam Extra" w:hAnsi="BRH Malayalam Extra" w:cs="BRH Malayalam Extra"/>
+                <w:sz w:val="40"/>
+                <w:szCs w:val="40"/>
+              </w:rPr>
+            </w:pPr>
+            <w:r>
+              <w:rPr>
+                <w:rFonts w:ascii="BRH Malayalam Extra" w:hAnsi="BRH Malayalam Extra" w:cs="BRH Malayalam Extra"/>
+                <w:sz w:val="40"/>
+                <w:szCs w:val="40"/>
+              </w:rPr>
+              <w:t>¤¤p</w:t>
+            </w:r>
+            <w:r>
+              <w:rPr>
+                <w:rFonts w:ascii="BRH Malayalam Extra" w:hAnsi="BRH Malayalam Extra" w:cs="BRH Malayalam Extra"/>
+                <w:sz w:val="34"/>
+                <w:szCs w:val="40"/>
+              </w:rPr>
+              <w:t>–</w:t>
+            </w:r>
+            <w:r>
+              <w:rPr>
+                <w:rFonts w:ascii="BRH Malayalam Extra" w:hAnsi="BRH Malayalam Extra" w:cs="BRH Malayalam Extra"/>
+                <w:sz w:val="40"/>
+                <w:szCs w:val="40"/>
+              </w:rPr>
+              <w:t>qûx</w:t>
+            </w:r>
+            <w:r>
+              <w:rPr>
+                <w:rFonts w:ascii="BRH Malayalam Extra" w:hAnsi="BRH Malayalam Extra" w:cs="BRH Malayalam Extra"/>
+                <w:sz w:val="34"/>
+                <w:szCs w:val="40"/>
+              </w:rPr>
+              <w:t>–</w:t>
+            </w:r>
+            <w:r>
+              <w:rPr>
+                <w:rFonts w:ascii="BRH Malayalam Extra" w:hAnsi="BRH Malayalam Extra" w:cs="BRH Malayalam Extra"/>
+                <w:sz w:val="40"/>
+                <w:szCs w:val="40"/>
+              </w:rPr>
+              <w:t>d</w:t>
+            </w:r>
+            <w:r>
+              <w:rPr>
+                <w:rFonts w:ascii="BRH Malayalam Extra" w:hAnsi="BRH Malayalam Extra" w:cs="BRH Malayalam Extra"/>
+                <w:sz w:val="34"/>
+                <w:szCs w:val="40"/>
+              </w:rPr>
+              <w:t>–</w:t>
             </w:r>
             <w:r>
               <w:rPr>
@@ -2082,28 +1694,26 @@
                 <w:sz w:val="40"/>
                 <w:szCs w:val="40"/>
                 <w:highlight w:val="green"/>
-                <w:lang w:val="it-IT"/>
-              </w:rPr>
-              <w:t>d</w:t>
-            </w:r>
-            <w:r>
-              <w:rPr>
-                <w:rFonts w:ascii="BRH Malayalam Extra" w:hAnsi="BRH Malayalam Extra" w:cs="BRH Malayalam Extra"/>
-                <w:sz w:val="34"/>
-                <w:szCs w:val="40"/>
-                <w:highlight w:val="green"/>
-                <w:lang w:val="it-IT"/>
-              </w:rPr>
-              <w:t>–</w:t>
-            </w:r>
-            <w:r>
-              <w:rPr>
-                <w:rFonts w:ascii="BRH Malayalam Extra" w:hAnsi="BRH Malayalam Extra" w:cs="BRH Malayalam Extra"/>
-                <w:sz w:val="40"/>
-                <w:szCs w:val="40"/>
-                <w:lang w:val="it-IT"/>
-              </w:rPr>
-              <w:t>J |</w:t>
+              </w:rPr>
+              <w:t>kJ</w:t>
+            </w:r>
+            <w:r>
+              <w:rPr>
+                <w:rFonts w:ascii="BRH Malayalam Extra" w:hAnsi="BRH Malayalam Extra" w:cs="BRH Malayalam Extra"/>
+                <w:sz w:val="40"/>
+                <w:szCs w:val="40"/>
+              </w:rPr>
+              <w:t xml:space="preserve"> | jZ§ | </w:t>
+            </w:r>
+            <w:r>
+              <w:rPr>
+                <w:rFonts w:cs="Arial"/>
+                <w:b/>
+                <w:bCs/>
+                <w:sz w:val="32"/>
+                <w:szCs w:val="36"/>
+              </w:rPr>
+              <w:t>38</w:t>
             </w:r>
           </w:p>
         </w:tc>
@@ -2118,6 +1728,7 @@
           <w:sz w:val="32"/>
           <w:szCs w:val="32"/>
           <w:u w:val="single"/>
+          <w:lang w:val="it-IT"/>
         </w:rPr>
       </w:pPr>
       <w:r>
@@ -2127,8 +1738,9 @@
           <w:sz w:val="32"/>
           <w:szCs w:val="32"/>
           <w:u w:val="single"/>
-        </w:rPr>
-        <w:t>=======================</w:t>
+          <w:lang w:val="it-IT"/>
+        </w:rPr>
+        <w:t>==========</w:t>
       </w:r>
     </w:p>
     <w:p>
@@ -2140,15 +1752,93 @@
           <w:sz w:val="32"/>
           <w:szCs w:val="32"/>
           <w:u w:val="single"/>
+          <w:lang w:val="it-IT"/>
         </w:rPr>
       </w:pPr>
-      <w:r>
+    </w:p>
+    <w:p>
+      <w:pPr>
+        <w:jc w:val="center"/>
         <w:rPr>
           <w:b/>
           <w:bCs/>
           <w:sz w:val="32"/>
           <w:szCs w:val="32"/>
           <w:u w:val="single"/>
+          <w:lang w:val="it-IT"/>
+        </w:rPr>
+      </w:pPr>
+    </w:p>
+    <w:p>
+      <w:pPr>
+        <w:jc w:val="center"/>
+        <w:rPr>
+          <w:b/>
+          <w:bCs/>
+          <w:sz w:val="32"/>
+          <w:szCs w:val="32"/>
+          <w:u w:val="single"/>
+          <w:lang w:val="it-IT"/>
+        </w:rPr>
+      </w:pPr>
+    </w:p>
+    <w:p>
+      <w:pPr>
+        <w:jc w:val="center"/>
+        <w:rPr>
+          <w:b/>
+          <w:bCs/>
+          <w:sz w:val="32"/>
+          <w:szCs w:val="32"/>
+          <w:u w:val="single"/>
+          <w:lang w:val="it-IT"/>
+        </w:rPr>
+      </w:pPr>
+    </w:p>
+    <w:p>
+      <w:pPr>
+        <w:jc w:val="center"/>
+        <w:rPr>
+          <w:b/>
+          <w:bCs/>
+          <w:sz w:val="32"/>
+          <w:szCs w:val="32"/>
+          <w:u w:val="single"/>
+          <w:lang w:val="it-IT"/>
+        </w:rPr>
+      </w:pPr>
+    </w:p>
+    <w:p>
+      <w:pPr>
+        <w:jc w:val="center"/>
+        <w:rPr>
+          <w:b/>
+          <w:bCs/>
+          <w:sz w:val="32"/>
+          <w:szCs w:val="32"/>
+          <w:u w:val="single"/>
+          <w:lang w:val="it-IT"/>
+        </w:rPr>
+      </w:pPr>
+    </w:p>
+    <w:p>
+      <w:pPr>
+        <w:jc w:val="center"/>
+        <w:rPr>
+          <w:b/>
+          <w:bCs/>
+          <w:sz w:val="32"/>
+          <w:szCs w:val="32"/>
+          <w:u w:val="single"/>
+        </w:rPr>
+      </w:pPr>
+      <w:r>
+        <w:rPr>
+          <w:b/>
+          <w:bCs/>
+          <w:sz w:val="32"/>
+          <w:szCs w:val="32"/>
+          <w:u w:val="single"/>
         </w:rPr>
         <w:t>TS Pada Paatam – TS 5.7 Malayalam co</w:t>
       </w:r>
@@ -2190,7 +1880,7 @@
           <w:szCs w:val="32"/>
           <w:u w:val="single"/>
         </w:rPr>
-        <w:t>31st May 2020</w:t>
+        <w:t>31st May 2021</w:t>
       </w:r>
     </w:p>
     <w:p>
@@ -2316,6 +2006,832 @@
       </w:tr>
       <w:tr>
         <w:trPr>
+          <w:trHeight w:val="964"/>
+        </w:trPr>
+        <w:tc>
+          <w:tcPr>
+            <w:tcW w:w="3168" w:type="dxa"/>
+            <w:tcBorders>
+              <w:top w:val="single" w:sz="4" w:space="0" w:color="000000"/>
+              <w:left w:val="single" w:sz="4" w:space="0" w:color="000000"/>
+              <w:bottom w:val="single" w:sz="4" w:space="0" w:color="000000"/>
+              <w:right w:val="single" w:sz="4" w:space="0" w:color="000000"/>
+            </w:tcBorders>
+          </w:tcPr>
+          <w:p>
+            <w:pPr>
+              <w:spacing w:before="0" w:line="240" w:lineRule="auto"/>
+              <w:rPr>
+                <w:rFonts w:cs="Latha"/>
+                <w:b/>
+                <w:sz w:val="28"/>
+                <w:szCs w:val="28"/>
+                <w:lang w:bidi="ta-IN"/>
+              </w:rPr>
+            </w:pPr>
+            <w:r>
+              <w:rPr>
+                <w:rFonts w:cs="Latha"/>
+                <w:b/>
+                <w:sz w:val="28"/>
+                <w:szCs w:val="28"/>
+                <w:lang w:bidi="ta-IN"/>
+              </w:rPr>
+              <w:t>5.7.5.</w:t>
+            </w:r>
+            <w:r>
+              <w:rPr>
+                <w:rFonts w:cs="Latha"/>
+                <w:b/>
+                <w:sz w:val="28"/>
+                <w:szCs w:val="28"/>
+                <w:lang w:bidi="ta-IN"/>
+              </w:rPr>
+              <w:t>3</w:t>
+            </w:r>
+            <w:r>
+              <w:rPr>
+                <w:rFonts w:cs="Latha"/>
+                <w:b/>
+                <w:sz w:val="28"/>
+                <w:szCs w:val="28"/>
+                <w:lang w:bidi="ta-IN"/>
+              </w:rPr>
+              <w:t xml:space="preserve"> – </w:t>
+            </w:r>
+            <w:r>
+              <w:rPr>
+                <w:rFonts w:cs="Latha"/>
+                <w:b/>
+                <w:sz w:val="28"/>
+                <w:szCs w:val="28"/>
+                <w:lang w:bidi="ta-IN"/>
+              </w:rPr>
+              <w:t>Vaakyam</w:t>
+            </w:r>
+          </w:p>
+          <w:p>
+            <w:pPr>
+              <w:spacing w:before="0" w:line="240" w:lineRule="auto"/>
+              <w:rPr>
+                <w:rFonts w:cs="Latha"/>
+                <w:b/>
+                <w:sz w:val="28"/>
+                <w:szCs w:val="28"/>
+                <w:lang w:bidi="ta-IN"/>
+              </w:rPr>
+            </w:pPr>
+            <w:r>
+              <w:rPr>
+                <w:rFonts w:cs="Latha"/>
+                <w:b/>
+                <w:sz w:val="28"/>
+                <w:szCs w:val="28"/>
+                <w:lang w:bidi="ta-IN"/>
+              </w:rPr>
+              <w:t xml:space="preserve">Line </w:t>
+            </w:r>
+            <w:r>
+              <w:rPr>
+                <w:rFonts w:cs="Latha"/>
+                <w:b/>
+                <w:sz w:val="28"/>
+                <w:szCs w:val="28"/>
+                <w:lang w:bidi="ta-IN"/>
+              </w:rPr>
+              <w:t xml:space="preserve"> No. </w:t>
+            </w:r>
+            <w:r>
+              <w:rPr>
+                <w:rFonts w:cs="Latha"/>
+                <w:b/>
+                <w:sz w:val="28"/>
+                <w:szCs w:val="28"/>
+                <w:lang w:bidi="ta-IN"/>
+              </w:rPr>
+              <w:t>- 1</w:t>
+            </w:r>
+          </w:p>
+          <w:p>
+            <w:pPr>
+              <w:spacing w:before="0" w:line="240" w:lineRule="auto"/>
+              <w:rPr>
+                <w:rFonts w:cs="Latha"/>
+                <w:b/>
+                <w:sz w:val="28"/>
+                <w:szCs w:val="28"/>
+                <w:lang w:bidi="ta-IN"/>
+              </w:rPr>
+            </w:pPr>
+            <w:r>
+              <w:rPr>
+                <w:rFonts w:cs="Latha"/>
+                <w:b/>
+                <w:sz w:val="28"/>
+                <w:szCs w:val="28"/>
+                <w:lang w:bidi="ta-IN"/>
+              </w:rPr>
+              <w:t>Panchaati  No.</w:t>
+            </w:r>
+            <w:r>
+              <w:rPr>
+                <w:rFonts w:cs="Latha"/>
+                <w:b/>
+                <w:sz w:val="28"/>
+                <w:szCs w:val="28"/>
+                <w:lang w:bidi="ta-IN"/>
+              </w:rPr>
+              <w:t xml:space="preserve"> - </w:t>
+            </w:r>
+            <w:r>
+              <w:rPr>
+                <w:rFonts w:cs="Latha"/>
+                <w:b/>
+                <w:sz w:val="28"/>
+                <w:szCs w:val="28"/>
+                <w:lang w:bidi="ta-IN"/>
+              </w:rPr>
+              <w:t xml:space="preserve"> </w:t>
+            </w:r>
+            <w:r>
+              <w:rPr>
+                <w:rFonts w:cs="Latha"/>
+                <w:b/>
+                <w:sz w:val="28"/>
+                <w:szCs w:val="28"/>
+                <w:lang w:bidi="ta-IN"/>
+              </w:rPr>
+              <w:t xml:space="preserve">19 </w:t>
+            </w:r>
+          </w:p>
+        </w:tc>
+        <w:tc>
+          <w:tcPr>
+            <w:tcW w:w="4820" w:type="dxa"/>
+            <w:tcBorders>
+              <w:top w:val="single" w:sz="4" w:space="0" w:color="000000"/>
+              <w:left w:val="single" w:sz="4" w:space="0" w:color="000000"/>
+              <w:bottom w:val="single" w:sz="4" w:space="0" w:color="000000"/>
+              <w:right w:val="single" w:sz="4" w:space="0" w:color="000000"/>
+            </w:tcBorders>
+          </w:tcPr>
+          <w:p>
+            <w:pPr>
+              <w:spacing w:before="0" w:line="240" w:lineRule="auto"/>
+              <w:ind w:left="132" w:right="-108"/>
+              <w:rPr>
+                <w:rFonts w:ascii="BRH Devanagari Extra" w:hAnsi="BRH Devanagari Extra" w:cs="BRH Devanagari Extra"/>
+                <w:sz w:val="40"/>
+                <w:szCs w:val="40"/>
+              </w:rPr>
+            </w:pPr>
+            <w:r>
+              <w:rPr>
+                <w:rFonts w:ascii="BRH Malayalam Extra" w:hAnsi="BRH Malayalam Extra" w:cs="BRH Malayalam Extra"/>
+                <w:sz w:val="40"/>
+                <w:szCs w:val="40"/>
+              </w:rPr>
+              <w:t xml:space="preserve">Bt¡—Zzª </w:t>
+            </w:r>
+            <w:r>
+              <w:rPr>
+                <w:rFonts w:ascii="BRH Malayalam Extra" w:hAnsi="BRH Malayalam Extra" w:cs="BRH Malayalam Extra"/>
+                <w:sz w:val="40"/>
+                <w:szCs w:val="40"/>
+                <w:highlight w:val="yellow"/>
+              </w:rPr>
+              <w:t>R¡¥</w:t>
+            </w:r>
+            <w:r>
+              <w:rPr>
+                <w:rFonts w:ascii="BRH Malayalam Extra" w:hAnsi="BRH Malayalam Extra" w:cs="BRH Malayalam Extra"/>
+                <w:sz w:val="40"/>
+                <w:szCs w:val="40"/>
+              </w:rPr>
+              <w:t>txZõ—ªKx-</w:t>
+            </w:r>
+          </w:p>
+        </w:tc>
+        <w:tc>
+          <w:tcPr>
+            <w:tcW w:w="4961" w:type="dxa"/>
+            <w:tcBorders>
+              <w:top w:val="single" w:sz="4" w:space="0" w:color="000000"/>
+              <w:left w:val="single" w:sz="4" w:space="0" w:color="000000"/>
+              <w:bottom w:val="single" w:sz="4" w:space="0" w:color="000000"/>
+              <w:right w:val="single" w:sz="4" w:space="0" w:color="000000"/>
+            </w:tcBorders>
+          </w:tcPr>
+          <w:p>
+            <w:pPr>
+              <w:spacing w:before="0" w:line="240" w:lineRule="auto"/>
+              <w:rPr>
+                <w:rFonts w:ascii="BRH Devanagari Extra" w:hAnsi="BRH Devanagari Extra" w:cs="BRH Devanagari Extra"/>
+                <w:sz w:val="40"/>
+                <w:szCs w:val="40"/>
+              </w:rPr>
+            </w:pPr>
+            <w:r>
+              <w:rPr>
+                <w:rFonts w:ascii="BRH Malayalam Extra" w:hAnsi="BRH Malayalam Extra" w:cs="BRH Malayalam Extra"/>
+                <w:sz w:val="40"/>
+                <w:szCs w:val="40"/>
+              </w:rPr>
+              <w:t xml:space="preserve">Bt¡—Zzª </w:t>
+            </w:r>
+            <w:r>
+              <w:rPr>
+                <w:rFonts w:ascii="BRH Malayalam Extra" w:hAnsi="BRH Malayalam Extra" w:cs="BRH Malayalam Extra"/>
+                <w:sz w:val="40"/>
+                <w:szCs w:val="40"/>
+                <w:highlight w:val="green"/>
+              </w:rPr>
+              <w:t>R¡</w:t>
+            </w:r>
+            <w:r>
+              <w:rPr>
+                <w:rFonts w:ascii="BRH Malayalam Extra" w:hAnsi="BRH Malayalam Extra" w:cs="BRH Malayalam Extra"/>
+                <w:sz w:val="34"/>
+                <w:szCs w:val="40"/>
+              </w:rPr>
+              <w:t>–</w:t>
+            </w:r>
+            <w:r>
+              <w:rPr>
+                <w:rFonts w:ascii="BRH Malayalam Extra" w:hAnsi="BRH Malayalam Extra" w:cs="BRH Malayalam Extra"/>
+                <w:sz w:val="40"/>
+                <w:szCs w:val="40"/>
+              </w:rPr>
+              <w:t>¥txZõ—ªKx-</w:t>
+            </w:r>
+          </w:p>
+        </w:tc>
+      </w:tr>
+      <w:tr>
+        <w:trPr>
+          <w:trHeight w:val="964"/>
+        </w:trPr>
+        <w:tc>
+          <w:tcPr>
+            <w:tcW w:w="3168" w:type="dxa"/>
+            <w:tcBorders>
+              <w:top w:val="single" w:sz="4" w:space="0" w:color="000000"/>
+              <w:left w:val="single" w:sz="4" w:space="0" w:color="000000"/>
+              <w:bottom w:val="single" w:sz="4" w:space="0" w:color="000000"/>
+              <w:right w:val="single" w:sz="4" w:space="0" w:color="000000"/>
+            </w:tcBorders>
+          </w:tcPr>
+          <w:p>
+            <w:pPr>
+              <w:spacing w:before="0" w:line="240" w:lineRule="auto"/>
+              <w:rPr>
+                <w:rFonts w:cs="Latha"/>
+                <w:b/>
+                <w:sz w:val="28"/>
+                <w:szCs w:val="28"/>
+                <w:lang w:val="it-IT" w:bidi="ta-IN"/>
+              </w:rPr>
+            </w:pPr>
+            <w:r>
+              <w:rPr>
+                <w:rFonts w:cs="Latha"/>
+                <w:b/>
+                <w:sz w:val="28"/>
+                <w:szCs w:val="28"/>
+                <w:lang w:val="it-IT" w:bidi="ta-IN"/>
+              </w:rPr>
+              <w:t>5.7.</w:t>
+            </w:r>
+            <w:r>
+              <w:rPr>
+                <w:rFonts w:cs="Latha"/>
+                <w:b/>
+                <w:sz w:val="28"/>
+                <w:szCs w:val="28"/>
+                <w:lang w:val="it-IT" w:bidi="ta-IN"/>
+              </w:rPr>
+              <w:t>8</w:t>
+            </w:r>
+            <w:r>
+              <w:rPr>
+                <w:rFonts w:cs="Latha"/>
+                <w:b/>
+                <w:sz w:val="28"/>
+                <w:szCs w:val="28"/>
+                <w:lang w:val="it-IT" w:bidi="ta-IN"/>
+              </w:rPr>
+              <w:t>.3 – Padam</w:t>
+            </w:r>
+          </w:p>
+          <w:p>
+            <w:pPr>
+              <w:spacing w:before="0" w:line="240" w:lineRule="auto"/>
+              <w:rPr>
+                <w:rFonts w:cs="Latha"/>
+                <w:b/>
+                <w:sz w:val="28"/>
+                <w:szCs w:val="28"/>
+                <w:lang w:val="it-IT" w:bidi="ta-IN"/>
+              </w:rPr>
+            </w:pPr>
+            <w:r>
+              <w:rPr>
+                <w:rFonts w:cs="Latha"/>
+                <w:b/>
+                <w:sz w:val="28"/>
+                <w:szCs w:val="28"/>
+                <w:lang w:val="it-IT" w:bidi="ta-IN"/>
+              </w:rPr>
+              <w:t>Padam No. - 7</w:t>
+            </w:r>
+          </w:p>
+          <w:p>
+            <w:pPr>
+              <w:spacing w:before="0" w:line="240" w:lineRule="auto"/>
+              <w:rPr>
+                <w:rFonts w:cs="Latha"/>
+                <w:sz w:val="28"/>
+                <w:szCs w:val="28"/>
+                <w:lang w:val="it-IT" w:bidi="ta-IN"/>
+              </w:rPr>
+            </w:pPr>
+            <w:r>
+              <w:rPr>
+                <w:rFonts w:cs="Latha"/>
+                <w:b/>
+                <w:sz w:val="28"/>
+                <w:szCs w:val="28"/>
+                <w:lang w:val="it-IT" w:bidi="ta-IN"/>
+              </w:rPr>
+              <w:t>Panchaati  No. -  35</w:t>
+            </w:r>
+          </w:p>
+        </w:tc>
+        <w:tc>
+          <w:tcPr>
+            <w:tcW w:w="4820" w:type="dxa"/>
+            <w:tcBorders>
+              <w:top w:val="single" w:sz="4" w:space="0" w:color="000000"/>
+              <w:left w:val="single" w:sz="4" w:space="0" w:color="000000"/>
+              <w:bottom w:val="single" w:sz="4" w:space="0" w:color="000000"/>
+              <w:right w:val="single" w:sz="4" w:space="0" w:color="000000"/>
+            </w:tcBorders>
+          </w:tcPr>
+          <w:p>
+            <w:pPr>
+              <w:spacing w:before="0" w:line="240" w:lineRule="auto"/>
+              <w:ind w:left="132" w:right="-108"/>
+              <w:rPr>
+                <w:rFonts w:ascii="BRH Devanagari Extra" w:hAnsi="BRH Devanagari Extra" w:cs="BRH Devanagari Extra"/>
+                <w:sz w:val="40"/>
+                <w:szCs w:val="40"/>
+                <w:lang w:val="it-IT"/>
+              </w:rPr>
+            </w:pPr>
+            <w:r>
+              <w:rPr>
+                <w:rFonts w:ascii="BRH Malayalam Extra" w:hAnsi="BRH Malayalam Extra" w:cs="BRH Malayalam Extra"/>
+                <w:sz w:val="40"/>
+                <w:szCs w:val="40"/>
+                <w:lang w:val="it-IT"/>
+              </w:rPr>
+              <w:t>Rx</w:t>
+            </w:r>
+            <w:r>
+              <w:rPr>
+                <w:rFonts w:ascii="BRH Malayalam Extra" w:hAnsi="BRH Malayalam Extra" w:cs="BRH Malayalam Extra"/>
+                <w:sz w:val="34"/>
+                <w:szCs w:val="40"/>
+                <w:lang w:val="it-IT"/>
+              </w:rPr>
+              <w:t>–</w:t>
+            </w:r>
+            <w:r>
+              <w:rPr>
+                <w:rFonts w:ascii="BRH Malayalam Extra" w:hAnsi="BRH Malayalam Extra" w:cs="BRH Malayalam Extra"/>
+                <w:sz w:val="40"/>
+                <w:szCs w:val="40"/>
+                <w:lang w:val="it-IT"/>
+              </w:rPr>
+              <w:t>dx</w:t>
+            </w:r>
+            <w:r>
+              <w:rPr>
+                <w:rFonts w:ascii="BRH Malayalam Extra" w:hAnsi="BRH Malayalam Extra" w:cs="BRH Malayalam Extra"/>
+                <w:sz w:val="34"/>
+                <w:szCs w:val="40"/>
+                <w:lang w:val="it-IT"/>
+              </w:rPr>
+              <w:t>–</w:t>
+            </w:r>
+            <w:r>
+              <w:rPr>
+                <w:rFonts w:ascii="BRH Malayalam Extra" w:hAnsi="BRH Malayalam Extra" w:cs="BRH Malayalam Extra"/>
+                <w:sz w:val="40"/>
+                <w:szCs w:val="40"/>
+                <w:lang w:val="it-IT"/>
+              </w:rPr>
+              <w:t>Zy</w:t>
+            </w:r>
+            <w:r>
+              <w:rPr>
+                <w:rFonts w:ascii="BRH Malayalam Extra" w:hAnsi="BRH Malayalam Extra" w:cs="BRH Malayalam Extra"/>
+                <w:sz w:val="34"/>
+                <w:szCs w:val="40"/>
+                <w:lang w:val="it-IT"/>
+              </w:rPr>
+              <w:t>–</w:t>
+            </w:r>
+            <w:r>
+              <w:rPr>
+                <w:rFonts w:ascii="BRH Malayalam Extra" w:hAnsi="BRH Malayalam Extra" w:cs="BRH Malayalam Extra"/>
+                <w:sz w:val="40"/>
+                <w:szCs w:val="40"/>
+                <w:lang w:val="it-IT"/>
+              </w:rPr>
+              <w:t xml:space="preserve"> | C</w:t>
+            </w:r>
+            <w:r>
+              <w:rPr>
+                <w:rFonts w:ascii="BRH Malayalam Extra" w:hAnsi="BRH Malayalam Extra" w:cs="BRH Malayalam Extra"/>
+                <w:sz w:val="34"/>
+                <w:szCs w:val="40"/>
+                <w:lang w:val="it-IT"/>
+              </w:rPr>
+              <w:t>–</w:t>
+            </w:r>
+            <w:r>
+              <w:rPr>
+                <w:rFonts w:ascii="BRH Malayalam Extra" w:hAnsi="BRH Malayalam Extra" w:cs="BRH Malayalam Extra"/>
+                <w:sz w:val="40"/>
+                <w:szCs w:val="40"/>
+                <w:lang w:val="it-IT"/>
+              </w:rPr>
+              <w:t xml:space="preserve">iI | </w:t>
+            </w:r>
+            <w:r>
+              <w:rPr>
+                <w:rFonts w:ascii="BRH Malayalam Extra" w:hAnsi="BRH Malayalam Extra" w:cs="BRH Malayalam Extra"/>
+                <w:sz w:val="40"/>
+                <w:szCs w:val="40"/>
+                <w:highlight w:val="yellow"/>
+                <w:lang w:val="it-IT"/>
+              </w:rPr>
+              <w:t>dJ</w:t>
+            </w:r>
+            <w:r>
+              <w:rPr>
+                <w:rFonts w:ascii="BRH Malayalam Extra" w:hAnsi="BRH Malayalam Extra" w:cs="BRH Malayalam Extra"/>
+                <w:sz w:val="40"/>
+                <w:szCs w:val="40"/>
+                <w:lang w:val="it-IT"/>
+              </w:rPr>
+              <w:t xml:space="preserve"> |</w:t>
+            </w:r>
+          </w:p>
+        </w:tc>
+        <w:tc>
+          <w:tcPr>
+            <w:tcW w:w="4961" w:type="dxa"/>
+            <w:tcBorders>
+              <w:top w:val="single" w:sz="4" w:space="0" w:color="000000"/>
+              <w:left w:val="single" w:sz="4" w:space="0" w:color="000000"/>
+              <w:bottom w:val="single" w:sz="4" w:space="0" w:color="000000"/>
+              <w:right w:val="single" w:sz="4" w:space="0" w:color="000000"/>
+            </w:tcBorders>
+          </w:tcPr>
+          <w:p>
+            <w:pPr>
+              <w:spacing w:before="0" w:line="240" w:lineRule="auto"/>
+              <w:rPr>
+                <w:rFonts w:ascii="BRH Devanagari Extra" w:hAnsi="BRH Devanagari Extra" w:cs="BRH Devanagari Extra"/>
+                <w:sz w:val="40"/>
+                <w:szCs w:val="40"/>
+                <w:lang w:val="it-IT"/>
+              </w:rPr>
+            </w:pPr>
+            <w:r>
+              <w:rPr>
+                <w:rFonts w:ascii="BRH Malayalam Extra" w:hAnsi="BRH Malayalam Extra" w:cs="BRH Malayalam Extra"/>
+                <w:sz w:val="40"/>
+                <w:szCs w:val="40"/>
+                <w:lang w:val="it-IT"/>
+              </w:rPr>
+              <w:t>Rx</w:t>
+            </w:r>
+            <w:r>
+              <w:rPr>
+                <w:rFonts w:ascii="BRH Malayalam Extra" w:hAnsi="BRH Malayalam Extra" w:cs="BRH Malayalam Extra"/>
+                <w:sz w:val="34"/>
+                <w:szCs w:val="40"/>
+                <w:lang w:val="it-IT"/>
+              </w:rPr>
+              <w:t>–</w:t>
+            </w:r>
+            <w:r>
+              <w:rPr>
+                <w:rFonts w:ascii="BRH Malayalam Extra" w:hAnsi="BRH Malayalam Extra" w:cs="BRH Malayalam Extra"/>
+                <w:sz w:val="40"/>
+                <w:szCs w:val="40"/>
+                <w:lang w:val="it-IT"/>
+              </w:rPr>
+              <w:t>dx</w:t>
+            </w:r>
+            <w:r>
+              <w:rPr>
+                <w:rFonts w:ascii="BRH Malayalam Extra" w:hAnsi="BRH Malayalam Extra" w:cs="BRH Malayalam Extra"/>
+                <w:sz w:val="34"/>
+                <w:szCs w:val="40"/>
+                <w:lang w:val="it-IT"/>
+              </w:rPr>
+              <w:t>–</w:t>
+            </w:r>
+            <w:r>
+              <w:rPr>
+                <w:rFonts w:ascii="BRH Malayalam Extra" w:hAnsi="BRH Malayalam Extra" w:cs="BRH Malayalam Extra"/>
+                <w:sz w:val="40"/>
+                <w:szCs w:val="40"/>
+                <w:lang w:val="it-IT"/>
+              </w:rPr>
+              <w:t>Zy</w:t>
+            </w:r>
+            <w:r>
+              <w:rPr>
+                <w:rFonts w:ascii="BRH Malayalam Extra" w:hAnsi="BRH Malayalam Extra" w:cs="BRH Malayalam Extra"/>
+                <w:sz w:val="34"/>
+                <w:szCs w:val="40"/>
+                <w:lang w:val="it-IT"/>
+              </w:rPr>
+              <w:t>–</w:t>
+            </w:r>
+            <w:r>
+              <w:rPr>
+                <w:rFonts w:ascii="BRH Malayalam Extra" w:hAnsi="BRH Malayalam Extra" w:cs="BRH Malayalam Extra"/>
+                <w:sz w:val="40"/>
+                <w:szCs w:val="40"/>
+                <w:lang w:val="it-IT"/>
+              </w:rPr>
+              <w:t xml:space="preserve"> | C</w:t>
+            </w:r>
+            <w:r>
+              <w:rPr>
+                <w:rFonts w:ascii="BRH Malayalam Extra" w:hAnsi="BRH Malayalam Extra" w:cs="BRH Malayalam Extra"/>
+                <w:sz w:val="34"/>
+                <w:szCs w:val="40"/>
+                <w:lang w:val="it-IT"/>
+              </w:rPr>
+              <w:t>–</w:t>
+            </w:r>
+            <w:r>
+              <w:rPr>
+                <w:rFonts w:ascii="BRH Malayalam Extra" w:hAnsi="BRH Malayalam Extra" w:cs="BRH Malayalam Extra"/>
+                <w:sz w:val="40"/>
+                <w:szCs w:val="40"/>
+                <w:lang w:val="it-IT"/>
+              </w:rPr>
+              <w:t xml:space="preserve">iI | </w:t>
+            </w:r>
+            <w:r>
+              <w:rPr>
+                <w:rFonts w:ascii="BRH Malayalam Extra" w:hAnsi="BRH Malayalam Extra" w:cs="BRH Malayalam Extra"/>
+                <w:sz w:val="40"/>
+                <w:szCs w:val="40"/>
+                <w:highlight w:val="green"/>
+                <w:lang w:val="it-IT"/>
+              </w:rPr>
+              <w:t>d</w:t>
+            </w:r>
+            <w:r>
+              <w:rPr>
+                <w:rFonts w:ascii="BRH Malayalam Extra" w:hAnsi="BRH Malayalam Extra" w:cs="BRH Malayalam Extra"/>
+                <w:sz w:val="34"/>
+                <w:szCs w:val="40"/>
+                <w:highlight w:val="green"/>
+                <w:lang w:val="it-IT"/>
+              </w:rPr>
+              <w:t>–</w:t>
+            </w:r>
+            <w:r>
+              <w:rPr>
+                <w:rFonts w:ascii="BRH Malayalam Extra" w:hAnsi="BRH Malayalam Extra" w:cs="BRH Malayalam Extra"/>
+                <w:sz w:val="40"/>
+                <w:szCs w:val="40"/>
+                <w:lang w:val="it-IT"/>
+              </w:rPr>
+              <w:t>J |</w:t>
+            </w:r>
+          </w:p>
+        </w:tc>
+      </w:tr>
+    </w:tbl>
+    <w:p>
+      <w:pPr>
+        <w:jc w:val="center"/>
+        <w:rPr>
+          <w:b/>
+          <w:bCs/>
+          <w:sz w:val="32"/>
+          <w:szCs w:val="32"/>
+          <w:u w:val="single"/>
+        </w:rPr>
+      </w:pPr>
+      <w:r>
+        <w:rPr>
+          <w:b/>
+          <w:bCs/>
+          <w:sz w:val="32"/>
+          <w:szCs w:val="32"/>
+          <w:u w:val="single"/>
+        </w:rPr>
+        <w:t>=======================</w:t>
+      </w:r>
+    </w:p>
+    <w:p>
+      <w:pPr>
+        <w:jc w:val="center"/>
+        <w:rPr>
+          <w:b/>
+          <w:bCs/>
+          <w:sz w:val="32"/>
+          <w:szCs w:val="32"/>
+          <w:u w:val="single"/>
+        </w:rPr>
+      </w:pPr>
+      <w:r>
+        <w:rPr>
+          <w:b/>
+          <w:bCs/>
+          <w:sz w:val="32"/>
+          <w:szCs w:val="32"/>
+          <w:u w:val="single"/>
+        </w:rPr>
+        <w:lastRenderedPageBreak/>
+        <w:t>TS Pada Paatam – TS 5.7 Malayalam co</w:t>
+      </w:r>
+      <w:r>
+        <w:rPr>
+          <w:b/>
+          <w:bCs/>
+          <w:sz w:val="32"/>
+          <w:szCs w:val="32"/>
+          <w:u w:val="single"/>
+        </w:rPr>
+        <w:t>rrections –</w:t>
+      </w:r>
+      <w:r>
+        <w:rPr>
+          <w:b/>
+          <w:bCs/>
+          <w:sz w:val="32"/>
+          <w:szCs w:val="32"/>
+          <w:u w:val="single"/>
+        </w:rPr>
+        <w:t xml:space="preserve"> </w:t>
+      </w:r>
+      <w:r>
+        <w:rPr>
+          <w:b/>
+          <w:bCs/>
+          <w:sz w:val="32"/>
+          <w:szCs w:val="32"/>
+          <w:u w:val="single"/>
+        </w:rPr>
+        <w:t xml:space="preserve">Observed till </w:t>
+      </w:r>
+      <w:r>
+        <w:rPr>
+          <w:b/>
+          <w:bCs/>
+          <w:sz w:val="32"/>
+          <w:szCs w:val="32"/>
+          <w:u w:val="single"/>
+        </w:rPr>
+        <w:t>31st May 2020</w:t>
+      </w:r>
+    </w:p>
+    <w:p>
+      <w:pPr>
+        <w:jc w:val="center"/>
+        <w:rPr>
+          <w:b/>
+          <w:bCs/>
+        </w:rPr>
+      </w:pPr>
+      <w:r>
+        <w:rPr>
+          <w:b/>
+          <w:bCs/>
+        </w:rPr>
+        <w:t xml:space="preserve"> (ignore those which are already incorporated in your book’s version and date)</w:t>
+      </w:r>
+    </w:p>
+    <w:tbl>
+      <w:tblPr>
+        <w:tblW w:w="12949" w:type="dxa"/>
+        <w:tblInd w:w="-792" w:type="dxa"/>
+        <w:tblBorders>
+          <w:top w:val="single" w:sz="4" w:space="0" w:color="000000"/>
+          <w:left w:val="single" w:sz="4" w:space="0" w:color="000000"/>
+          <w:bottom w:val="single" w:sz="4" w:space="0" w:color="000000"/>
+          <w:right w:val="single" w:sz="4" w:space="0" w:color="000000"/>
+          <w:insideH w:val="single" w:sz="4" w:space="0" w:color="000000"/>
+          <w:insideV w:val="single" w:sz="4" w:space="0" w:color="000000"/>
+        </w:tblBorders>
+        <w:tblLook w:val="04A0" w:firstRow="1" w:lastRow="0" w:firstColumn="1" w:lastColumn="0" w:noHBand="0" w:noVBand="1"/>
+      </w:tblPr>
+      <w:tblGrid>
+        <w:gridCol w:w="3168"/>
+        <w:gridCol w:w="4820"/>
+        <w:gridCol w:w="4961"/>
+      </w:tblGrid>
+      <w:tr>
+        <w:tc>
+          <w:tcPr>
+            <w:tcW w:w="3168" w:type="dxa"/>
+          </w:tcPr>
+          <w:p>
+            <w:pPr>
+              <w:spacing w:before="0" w:line="240" w:lineRule="auto"/>
+              <w:jc w:val="center"/>
+              <w:rPr>
+                <w:sz w:val="32"/>
+                <w:szCs w:val="32"/>
+              </w:rPr>
+            </w:pPr>
+            <w:r>
+              <w:rPr>
+                <w:sz w:val="32"/>
+                <w:szCs w:val="32"/>
+              </w:rPr>
+              <w:t>Section, Paragraph</w:t>
+            </w:r>
+          </w:p>
+          <w:p>
+            <w:pPr>
+              <w:spacing w:before="0" w:line="240" w:lineRule="auto"/>
+              <w:jc w:val="center"/>
+              <w:rPr>
+                <w:sz w:val="32"/>
+                <w:szCs w:val="32"/>
+              </w:rPr>
+            </w:pPr>
+            <w:r>
+              <w:rPr>
+                <w:sz w:val="32"/>
+                <w:szCs w:val="32"/>
+              </w:rPr>
+              <w:t>Reference</w:t>
+            </w:r>
+          </w:p>
+        </w:tc>
+        <w:tc>
+          <w:tcPr>
+            <w:tcW w:w="4820" w:type="dxa"/>
+          </w:tcPr>
+          <w:p>
+            <w:pPr>
+              <w:spacing w:before="0" w:line="240" w:lineRule="auto"/>
+              <w:jc w:val="center"/>
+              <w:rPr>
+                <w:sz w:val="32"/>
+                <w:szCs w:val="32"/>
+              </w:rPr>
+            </w:pPr>
+            <w:r>
+              <w:rPr>
+                <w:sz w:val="32"/>
+                <w:szCs w:val="32"/>
+              </w:rPr>
+              <w:t>As Printed</w:t>
+            </w:r>
+          </w:p>
+        </w:tc>
+        <w:tc>
+          <w:tcPr>
+            <w:tcW w:w="4961" w:type="dxa"/>
+          </w:tcPr>
+          <w:p>
+            <w:pPr>
+              <w:spacing w:before="0" w:line="240" w:lineRule="auto"/>
+              <w:ind w:right="-18"/>
+              <w:jc w:val="center"/>
+              <w:rPr>
+                <w:sz w:val="32"/>
+                <w:szCs w:val="32"/>
+              </w:rPr>
+            </w:pPr>
+            <w:r>
+              <w:rPr>
+                <w:sz w:val="32"/>
+                <w:szCs w:val="32"/>
+              </w:rPr>
+              <w:t>To be read as or corrected as</w:t>
+            </w:r>
+          </w:p>
+        </w:tc>
+      </w:tr>
+      <w:tr>
+        <w:trPr>
           <w:trHeight w:val="1659"/>
         </w:trPr>
         <w:tc>
@@ -2696,7 +3212,6 @@
                 <w:lang w:bidi="ta-IN"/>
               </w:rPr>
             </w:pPr>
-            <w:proofErr w:type="gramStart"/>
             <w:r>
               <w:rPr>
                 <w:rFonts w:cs="Latha"/>
@@ -2704,17 +3219,7 @@
                 <w:szCs w:val="28"/>
                 <w:lang w:bidi="ta-IN"/>
               </w:rPr>
-              <w:t>Panchaati  No.</w:t>
-            </w:r>
-            <w:proofErr w:type="gramEnd"/>
-            <w:r>
-              <w:rPr>
-                <w:rFonts w:cs="Latha"/>
-                <w:sz w:val="28"/>
-                <w:szCs w:val="28"/>
-                <w:lang w:bidi="ta-IN"/>
-              </w:rPr>
-              <w:t xml:space="preserve"> </w:t>
+              <w:t xml:space="preserve">Panchaati  No. </w:t>
             </w:r>
             <w:r>
               <w:rPr>
@@ -2939,7 +3444,6 @@
                 <w:szCs w:val="28"/>
                 <w:lang w:val="it-IT" w:bidi="ta-IN"/>
               </w:rPr>
-              <w:lastRenderedPageBreak/>
               <w:t>5.7.8.1 – Padam</w:t>
             </w:r>
           </w:p>
@@ -3599,7 +4103,6 @@
                 <w:lang w:bidi="ta-IN"/>
               </w:rPr>
             </w:pPr>
-            <w:proofErr w:type="gramStart"/>
             <w:r>
               <w:rPr>
                 <w:rFonts w:cs="Latha"/>
@@ -3607,17 +4110,7 @@
                 <w:szCs w:val="28"/>
                 <w:lang w:bidi="ta-IN"/>
               </w:rPr>
-              <w:t>Panchaati  No.</w:t>
-            </w:r>
-            <w:proofErr w:type="gramEnd"/>
-            <w:r>
-              <w:rPr>
-                <w:rFonts w:cs="Latha"/>
-                <w:sz w:val="28"/>
-                <w:szCs w:val="28"/>
-                <w:lang w:bidi="ta-IN"/>
-              </w:rPr>
-              <w:t xml:space="preserve"> </w:t>
+              <w:t xml:space="preserve">Panchaati  No. </w:t>
             </w:r>
             <w:r>
               <w:rPr>
@@ -3857,6 +4350,7 @@
           <w:szCs w:val="32"/>
           <w:u w:val="single"/>
         </w:rPr>
+        <w:lastRenderedPageBreak/>
         <w:t>TS Pada Paatam – TS 5.7 Malayalam co</w:t>
       </w:r>
       <w:r>
@@ -4603,7 +5097,6 @@
                 <w:szCs w:val="28"/>
                 <w:lang w:bidi="ta-IN"/>
               </w:rPr>
-              <w:lastRenderedPageBreak/>
               <w:t>5.7.8.2 –</w:t>
             </w:r>
             <w:r>
@@ -5391,6 +5884,7 @@
           <w:szCs w:val="32"/>
           <w:u w:val="single"/>
         </w:rPr>
+        <w:lastRenderedPageBreak/>
         <w:t>TS</w:t>
       </w:r>
       <w:r>

</xml_diff>